<commit_message>
Atualização da documentação do sistema
atualização do sistema acrescentado os itens do 2 ao 6
</commit_message>
<xml_diff>
--- a/Documentação Sistema barber prime 1.0.docx
+++ b/Documentação Sistema barber prime 1.0.docx
@@ -1320,21 +1320,8 @@
       <w:bookmarkEnd w:id="8"/>
     </w:p>
     <w:p>
-      <w:pPr>
-        <w:jc w:val="both"/>
-      </w:pPr>
       <w:r>
-        <w:t>Este documento especifica os requisitos do sistema</w:t>
-      </w:r>
-      <w:r>
-        <w:t xml:space="preserve"> </w:t>
-      </w:r>
-      <w:r>
-        <w:rPr>
-          <w:sz w:val="22"/>
-          <w:szCs w:val="22"/>
-        </w:rPr>
-        <w:t xml:space="preserve">Site da Barbearia </w:t>
+        <w:t xml:space="preserve">Este documento descreve os requisitos funcionais e não funcionais do sistema </w:t>
       </w:r>
       <w:proofErr w:type="spellStart"/>
       <w:r>
@@ -1342,123 +1329,3070 @@
       </w:r>
       <w:proofErr w:type="spellEnd"/>
       <w:r>
-        <w:t xml:space="preserve"> </w:t>
+        <w:t xml:space="preserve"> Prime, um site institucional com funcionalidades de apresentação, catálogo de produtos, catálogo de serviços e módulo de agendamento, além de um painel administrativo para gestão dos agendamentos e produtos.</w:t>
       </w:r>
-      <w:proofErr w:type="gramStart"/>
+    </w:p>
+    <w:p>
+      <w:pPr>
+        <w:pStyle w:val="Ttulo1"/>
+      </w:pPr>
       <w:r>
-        <w:t>Prime</w:t>
+        <w:t>Descrição Geral do Sistema</w:t>
+      </w:r>
+    </w:p>
+    <w:p>
+      <w:r>
+        <w:t xml:space="preserve">O sistema </w:t>
+      </w:r>
+      <w:proofErr w:type="spellStart"/>
+      <w:r>
+        <w:t>Barber</w:t>
+      </w:r>
+      <w:proofErr w:type="spellEnd"/>
+      <w:r>
+        <w:t xml:space="preserve"> Prime é uma plataforma web desenvolvida para uma barbearia moderna que deseja facilitar o contato com clientes, exibir serviços e produtos, além de permitir agendamentos de forma prática.</w:t>
+      </w:r>
+    </w:p>
+    <w:p/>
+    <w:p>
+      <w:r>
+        <w:t>Principais módulos:</w:t>
+      </w:r>
+    </w:p>
+    <w:p>
+      <w:pPr>
+        <w:pStyle w:val="Commarcadores"/>
+        <w:tabs>
+          <w:tab w:val="num" w:pos="360"/>
+        </w:tabs>
+        <w:spacing w:before="0" w:after="200" w:line="276" w:lineRule="auto"/>
+        <w:ind w:left="360" w:hanging="360"/>
+        <w:contextualSpacing/>
+        <w:jc w:val="left"/>
+      </w:pPr>
+      <w:r>
+        <w:t>• Home — Apresentação geral da barbearia.</w:t>
+      </w:r>
+    </w:p>
+    <w:p>
+      <w:pPr>
+        <w:pStyle w:val="Commarcadores"/>
+        <w:tabs>
+          <w:tab w:val="num" w:pos="360"/>
+        </w:tabs>
+        <w:spacing w:before="0" w:after="200" w:line="276" w:lineRule="auto"/>
+        <w:ind w:left="360" w:hanging="360"/>
+        <w:contextualSpacing/>
+        <w:jc w:val="left"/>
+      </w:pPr>
+      <w:r>
+        <w:t>• Quem Somos — História, missão, visão e valores.</w:t>
+      </w:r>
+    </w:p>
+    <w:p>
+      <w:pPr>
+        <w:pStyle w:val="Commarcadores"/>
+        <w:tabs>
+          <w:tab w:val="num" w:pos="360"/>
+        </w:tabs>
+        <w:spacing w:before="0" w:after="200" w:line="276" w:lineRule="auto"/>
+        <w:ind w:left="360" w:hanging="360"/>
+        <w:contextualSpacing/>
+        <w:jc w:val="left"/>
+      </w:pPr>
+      <w:r>
+        <w:t>• Serviços — Lista de serviços com opção de agendar.</w:t>
+      </w:r>
+    </w:p>
+    <w:p>
+      <w:pPr>
+        <w:pStyle w:val="Commarcadores"/>
+        <w:tabs>
+          <w:tab w:val="num" w:pos="360"/>
+        </w:tabs>
+        <w:spacing w:before="0" w:after="200" w:line="276" w:lineRule="auto"/>
+        <w:ind w:left="360" w:hanging="360"/>
+        <w:contextualSpacing/>
+        <w:jc w:val="left"/>
+      </w:pPr>
+      <w:r>
+        <w:t>• Produtos — Catálogo de produtos de estética e perfumaria.</w:t>
+      </w:r>
+    </w:p>
+    <w:p>
+      <w:pPr>
+        <w:pStyle w:val="Commarcadores"/>
+        <w:tabs>
+          <w:tab w:val="num" w:pos="360"/>
+        </w:tabs>
+        <w:spacing w:before="0" w:after="200" w:line="276" w:lineRule="auto"/>
+        <w:ind w:left="360" w:hanging="360"/>
+        <w:contextualSpacing/>
+        <w:jc w:val="left"/>
+      </w:pPr>
+      <w:r>
+        <w:t>• Login — Acesso ao painel do administrador.</w:t>
+      </w:r>
+    </w:p>
+    <w:p>
+      <w:pPr>
+        <w:pStyle w:val="Commarcadores"/>
+        <w:tabs>
+          <w:tab w:val="num" w:pos="360"/>
+        </w:tabs>
+        <w:spacing w:before="0" w:after="200" w:line="276" w:lineRule="auto"/>
+        <w:ind w:left="360" w:hanging="360"/>
+        <w:contextualSpacing/>
+        <w:jc w:val="left"/>
+      </w:pPr>
+      <w:r>
+        <w:t>• Painel Administrativo — Gestão de agendamentos e produtos.</w:t>
+      </w:r>
+    </w:p>
+    <w:p>
+      <w:pPr>
+        <w:pStyle w:val="Ttulo1"/>
+      </w:pPr>
+      <w:r>
+        <w:t xml:space="preserve"> Requisitos Funcionais</w:t>
+      </w:r>
+    </w:p>
+    <w:p>
+      <w:pPr>
+        <w:pStyle w:val="Ttulo3"/>
+      </w:pPr>
+      <w:r>
+        <w:t>RF001 – Autenticação do Administrador</w:t>
+      </w:r>
+    </w:p>
+    <w:p>
+      <w:r>
+        <w:t>O sistema deve permitir que o administrador realize login utilizando usuário e senha.</w:t>
+      </w:r>
+    </w:p>
+    <w:p>
+      <w:pPr>
+        <w:pStyle w:val="Ttulo3"/>
+      </w:pPr>
+      <w:r>
+        <w:t>RF002 – Gerenciamento de Produtos</w:t>
+      </w:r>
+    </w:p>
+    <w:p>
+      <w:r>
+        <w:t>O administrador poderá cadastrar, editar, remover e listar produtos.</w:t>
+      </w:r>
+    </w:p>
+    <w:p>
+      <w:pPr>
+        <w:pStyle w:val="Ttulo3"/>
+      </w:pPr>
+      <w:r>
+        <w:t>RF003 – Gerenciamento de Serviços</w:t>
+      </w:r>
+    </w:p>
+    <w:p>
+      <w:r>
+        <w:t>O administrador poderá cadastrar, editar, remover e listar serviços oferecidos.</w:t>
+      </w:r>
+    </w:p>
+    <w:p>
+      <w:pPr>
+        <w:pStyle w:val="Ttulo3"/>
+      </w:pPr>
+      <w:r>
+        <w:t>RF004 – Agendamento de Serviços</w:t>
+      </w:r>
+    </w:p>
+    <w:p>
+      <w:r>
+        <w:t>O cliente poderá solicitar agendamento através da página de serviços.</w:t>
+      </w:r>
+    </w:p>
+    <w:p>
+      <w:pPr>
+        <w:pStyle w:val="Ttulo3"/>
+      </w:pPr>
+      <w:r>
+        <w:t>RF005 – Visualização de Agendamentos</w:t>
+      </w:r>
+    </w:p>
+    <w:p>
+      <w:r>
+        <w:t>O administrador poderá listar e gerenciar os agendamentos realizados pelos clientes.</w:t>
+      </w:r>
+    </w:p>
+    <w:p>
+      <w:pPr>
+        <w:pStyle w:val="Ttulo3"/>
+      </w:pPr>
+      <w:r>
+        <w:t>RF006 – Catálogo de Produtos</w:t>
+      </w:r>
+    </w:p>
+    <w:p>
+      <w:r>
+        <w:t>O cliente poderá visualizar produtos disponíveis com descrição e preço.</w:t>
+      </w:r>
+    </w:p>
+    <w:p>
+      <w:pPr>
+        <w:pStyle w:val="Ttulo3"/>
+      </w:pPr>
+      <w:r>
+        <w:t>RF007 – Página Quem Somos</w:t>
+      </w:r>
+    </w:p>
+    <w:p>
+      <w:r>
+        <w:t>O sistema disponibilizará a história e informações institucionais da barbearia.</w:t>
+      </w:r>
+    </w:p>
+    <w:p>
+      <w:pPr>
+        <w:pStyle w:val="Ttulo3"/>
+      </w:pPr>
+      <w:r>
+        <w:lastRenderedPageBreak/>
+        <w:t>RF008 – Página Home</w:t>
+      </w:r>
+    </w:p>
+    <w:p>
+      <w:r>
+        <w:t>A página inicial exibirá informações gerais, destaque de serviços e promoções.</w:t>
+      </w:r>
+    </w:p>
+    <w:p>
+      <w:pPr>
+        <w:pStyle w:val="Ttulo1"/>
+      </w:pPr>
+      <w:r>
+        <w:t>Requisitos Não Funcionais</w:t>
+      </w:r>
+    </w:p>
+    <w:p>
+      <w:pPr>
+        <w:pStyle w:val="Commarcadores"/>
+        <w:tabs>
+          <w:tab w:val="num" w:pos="360"/>
+        </w:tabs>
+        <w:spacing w:before="0" w:after="200" w:line="276" w:lineRule="auto"/>
+        <w:ind w:left="360" w:hanging="360"/>
+        <w:contextualSpacing/>
+        <w:jc w:val="left"/>
+      </w:pPr>
+      <w:r>
+        <w:t>• Usabilidade: Interface moderna, responsiva e intuitiva.</w:t>
+      </w:r>
+    </w:p>
+    <w:p>
+      <w:pPr>
+        <w:pStyle w:val="Commarcadores"/>
+        <w:tabs>
+          <w:tab w:val="num" w:pos="360"/>
+        </w:tabs>
+        <w:spacing w:before="0" w:after="200" w:line="276" w:lineRule="auto"/>
+        <w:ind w:left="360" w:hanging="360"/>
+        <w:contextualSpacing/>
+        <w:jc w:val="left"/>
+      </w:pPr>
+      <w:r>
+        <w:t>• Desempenho: O site deve carregar em até 3 segundos em conexões comuns.</w:t>
+      </w:r>
+    </w:p>
+    <w:p>
+      <w:pPr>
+        <w:pStyle w:val="Commarcadores"/>
+        <w:tabs>
+          <w:tab w:val="num" w:pos="360"/>
+        </w:tabs>
+        <w:spacing w:before="0" w:after="200" w:line="276" w:lineRule="auto"/>
+        <w:ind w:left="360" w:hanging="360"/>
+        <w:contextualSpacing/>
+        <w:jc w:val="left"/>
+      </w:pPr>
+      <w:r>
+        <w:t>• Segurança: Senhas criptografadas; painel administrativo protegido.</w:t>
+      </w:r>
+    </w:p>
+    <w:p>
+      <w:pPr>
+        <w:pStyle w:val="Commarcadores"/>
+        <w:tabs>
+          <w:tab w:val="num" w:pos="360"/>
+        </w:tabs>
+        <w:spacing w:before="0" w:after="200" w:line="276" w:lineRule="auto"/>
+        <w:ind w:left="360" w:hanging="360"/>
+        <w:contextualSpacing/>
+        <w:jc w:val="left"/>
+      </w:pPr>
+      <w:r>
+        <w:t>• Compatibilidade: Suporte a navegadores modernos em desktop e dispositivos móveis.</w:t>
+      </w:r>
+    </w:p>
+    <w:p>
+      <w:pPr>
+        <w:pStyle w:val="Commarcadores"/>
+        <w:tabs>
+          <w:tab w:val="num" w:pos="360"/>
+        </w:tabs>
+        <w:spacing w:before="0" w:after="200" w:line="276" w:lineRule="auto"/>
+        <w:ind w:left="360" w:hanging="360"/>
+        <w:contextualSpacing/>
+        <w:jc w:val="left"/>
+      </w:pPr>
+    </w:p>
+    <w:p>
+      <w:pPr>
+        <w:pStyle w:val="Ttulo1"/>
+      </w:pPr>
+      <w:r>
+        <w:t>Diagramação e prototipação de Banco de dados</w:t>
+      </w:r>
+    </w:p>
+    <w:p>
+      <w:r>
+        <w:t>Definição</w:t>
       </w:r>
       <w:r>
         <w:t xml:space="preserve"> </w:t>
       </w:r>
       <w:r>
-        <w:rPr>
-          <w:i/>
-          <w:iCs/>
-          <w:sz w:val="22"/>
-          <w:szCs w:val="22"/>
-        </w:rPr>
-        <w:t>.</w:t>
-      </w:r>
-      <w:proofErr w:type="gramEnd"/>
-      <w:r>
-        <w:t xml:space="preserve"> fornecendo aos desenvolvedores</w:t>
-      </w:r>
-      <w:r>
-        <w:t xml:space="preserve"> e stakeholders </w:t>
-      </w:r>
-      <w:r>
-        <w:t xml:space="preserve"> as informações necessárias para o projeto e implementação, assim como para a realização dos testes e homologação do sistema.</w:t>
+        <w:t>de tabela de Cadastro de produtos</w:t>
       </w:r>
     </w:p>
+    <w:tbl>
+      <w:tblPr>
+        <w:tblW w:w="9298" w:type="dxa"/>
+        <w:jc w:val="center"/>
+        <w:tblBorders>
+          <w:top w:val="single" w:sz="8" w:space="0" w:color="404040"/>
+          <w:left w:val="single" w:sz="8" w:space="0" w:color="404040"/>
+          <w:bottom w:val="single" w:sz="8" w:space="0" w:color="404040"/>
+          <w:right w:val="single" w:sz="8" w:space="0" w:color="404040"/>
+          <w:insideH w:val="single" w:sz="8" w:space="0" w:color="404040"/>
+          <w:insideV w:val="single" w:sz="8" w:space="0" w:color="404040"/>
+        </w:tblBorders>
+        <w:shd w:val="clear" w:color="auto" w:fill="D9D9D9"/>
+        <w:tblLayout w:type="fixed"/>
+        <w:tblLook w:val="04A0" w:firstRow="1" w:lastRow="0" w:firstColumn="1" w:lastColumn="0" w:noHBand="0" w:noVBand="1"/>
+      </w:tblPr>
+      <w:tblGrid>
+        <w:gridCol w:w="2286"/>
+        <w:gridCol w:w="3201"/>
+        <w:gridCol w:w="915"/>
+        <w:gridCol w:w="1829"/>
+        <w:gridCol w:w="1067"/>
+      </w:tblGrid>
+      <w:tr>
+        <w:trPr>
+          <w:trHeight w:val="217"/>
+          <w:jc w:val="center"/>
+        </w:trPr>
+        <w:tc>
+          <w:tcPr>
+            <w:tcW w:w="2286" w:type="dxa"/>
+            <w:shd w:val="clear" w:color="auto" w:fill="D9D9D9"/>
+          </w:tcPr>
+          <w:p>
+            <w:pPr>
+              <w:suppressAutoHyphens/>
+              <w:ind w:left="142"/>
+              <w:jc w:val="center"/>
+              <w:rPr>
+                <w:rFonts w:eastAsia="Calibri"/>
+                <w:b/>
+                <w:bCs/>
+                <w:sz w:val="22"/>
+                <w:szCs w:val="22"/>
+              </w:rPr>
+            </w:pPr>
+            <w:r>
+              <w:rPr>
+                <w:rFonts w:eastAsia="Calibri"/>
+                <w:b/>
+                <w:bCs/>
+                <w:sz w:val="22"/>
+                <w:szCs w:val="22"/>
+              </w:rPr>
+              <w:t>Atributo</w:t>
+            </w:r>
+          </w:p>
+        </w:tc>
+        <w:tc>
+          <w:tcPr>
+            <w:tcW w:w="3201" w:type="dxa"/>
+            <w:shd w:val="clear" w:color="auto" w:fill="D9D9D9"/>
+          </w:tcPr>
+          <w:p>
+            <w:pPr>
+              <w:suppressAutoHyphens/>
+              <w:ind w:left="142"/>
+              <w:jc w:val="center"/>
+              <w:rPr>
+                <w:rFonts w:eastAsia="Calibri"/>
+                <w:b/>
+                <w:sz w:val="22"/>
+                <w:szCs w:val="22"/>
+              </w:rPr>
+            </w:pPr>
+            <w:r>
+              <w:rPr>
+                <w:rFonts w:eastAsia="Calibri"/>
+                <w:b/>
+                <w:sz w:val="22"/>
+                <w:szCs w:val="22"/>
+              </w:rPr>
+              <w:t>Tipo</w:t>
+            </w:r>
+          </w:p>
+        </w:tc>
+        <w:tc>
+          <w:tcPr>
+            <w:tcW w:w="915" w:type="dxa"/>
+            <w:shd w:val="clear" w:color="auto" w:fill="D9D9D9"/>
+          </w:tcPr>
+          <w:p>
+            <w:pPr>
+              <w:suppressAutoHyphens/>
+              <w:ind w:left="142"/>
+              <w:jc w:val="center"/>
+              <w:rPr>
+                <w:rFonts w:eastAsia="Calibri"/>
+                <w:b/>
+                <w:sz w:val="22"/>
+                <w:szCs w:val="22"/>
+              </w:rPr>
+            </w:pPr>
+            <w:r>
+              <w:rPr>
+                <w:rFonts w:eastAsia="Calibri"/>
+                <w:b/>
+                <w:sz w:val="22"/>
+                <w:szCs w:val="22"/>
+              </w:rPr>
+              <w:t>Tam.</w:t>
+            </w:r>
+          </w:p>
+        </w:tc>
+        <w:tc>
+          <w:tcPr>
+            <w:tcW w:w="1829" w:type="dxa"/>
+            <w:shd w:val="clear" w:color="auto" w:fill="D9D9D9"/>
+          </w:tcPr>
+          <w:p>
+            <w:pPr>
+              <w:suppressAutoHyphens/>
+              <w:ind w:left="142"/>
+              <w:jc w:val="center"/>
+              <w:rPr>
+                <w:rFonts w:eastAsia="Calibri"/>
+                <w:b/>
+                <w:sz w:val="22"/>
+                <w:szCs w:val="22"/>
+              </w:rPr>
+            </w:pPr>
+            <w:r>
+              <w:rPr>
+                <w:rFonts w:eastAsia="Calibri"/>
+                <w:b/>
+                <w:sz w:val="22"/>
+                <w:szCs w:val="22"/>
+              </w:rPr>
+              <w:t>Máscara</w:t>
+            </w:r>
+          </w:p>
+        </w:tc>
+        <w:tc>
+          <w:tcPr>
+            <w:tcW w:w="1067" w:type="dxa"/>
+            <w:shd w:val="clear" w:color="auto" w:fill="D9D9D9"/>
+          </w:tcPr>
+          <w:p>
+            <w:pPr>
+              <w:suppressAutoHyphens/>
+              <w:ind w:left="142"/>
+              <w:jc w:val="center"/>
+              <w:rPr>
+                <w:rFonts w:eastAsia="Calibri"/>
+                <w:b/>
+                <w:sz w:val="22"/>
+                <w:szCs w:val="22"/>
+              </w:rPr>
+            </w:pPr>
+            <w:proofErr w:type="spellStart"/>
+            <w:r>
+              <w:rPr>
+                <w:rFonts w:eastAsia="Calibri"/>
+                <w:b/>
+                <w:sz w:val="22"/>
+                <w:szCs w:val="22"/>
+              </w:rPr>
+              <w:t>Obrig</w:t>
+            </w:r>
+            <w:proofErr w:type="spellEnd"/>
+            <w:r>
+              <w:rPr>
+                <w:rFonts w:eastAsia="Calibri"/>
+                <w:b/>
+                <w:sz w:val="22"/>
+                <w:szCs w:val="22"/>
+              </w:rPr>
+              <w:t>.</w:t>
+            </w:r>
+          </w:p>
+        </w:tc>
+      </w:tr>
+      <w:tr>
+        <w:trPr>
+          <w:trHeight w:val="241"/>
+          <w:jc w:val="center"/>
+        </w:trPr>
+        <w:tc>
+          <w:tcPr>
+            <w:tcW w:w="2286" w:type="dxa"/>
+            <w:shd w:val="clear" w:color="auto" w:fill="D9D9D9"/>
+          </w:tcPr>
+          <w:p>
+            <w:pPr>
+              <w:suppressAutoHyphens/>
+              <w:ind w:left="142"/>
+              <w:rPr>
+                <w:rFonts w:eastAsia="Calibri"/>
+                <w:b/>
+                <w:bCs/>
+                <w:sz w:val="22"/>
+                <w:szCs w:val="22"/>
+              </w:rPr>
+            </w:pPr>
+            <w:r>
+              <w:rPr>
+                <w:rFonts w:eastAsia="Calibri"/>
+                <w:b/>
+                <w:bCs/>
+                <w:sz w:val="22"/>
+                <w:szCs w:val="22"/>
+              </w:rPr>
+              <w:t>ID</w:t>
+            </w:r>
+          </w:p>
+        </w:tc>
+        <w:tc>
+          <w:tcPr>
+            <w:tcW w:w="3201" w:type="dxa"/>
+            <w:shd w:val="clear" w:color="auto" w:fill="D9D9D9"/>
+          </w:tcPr>
+          <w:p>
+            <w:pPr>
+              <w:suppressAutoHyphens/>
+              <w:ind w:left="142"/>
+              <w:rPr>
+                <w:rFonts w:eastAsia="Calibri"/>
+                <w:sz w:val="22"/>
+                <w:szCs w:val="22"/>
+                <w:lang w:eastAsia="en-US"/>
+              </w:rPr>
+            </w:pPr>
+            <w:proofErr w:type="spellStart"/>
+            <w:r>
+              <w:rPr>
+                <w:rFonts w:eastAsia="Calibri"/>
+                <w:sz w:val="22"/>
+                <w:szCs w:val="22"/>
+                <w:lang w:eastAsia="en-US"/>
+              </w:rPr>
+              <w:t>Int</w:t>
+            </w:r>
+            <w:proofErr w:type="spellEnd"/>
+          </w:p>
+        </w:tc>
+        <w:tc>
+          <w:tcPr>
+            <w:tcW w:w="915" w:type="dxa"/>
+            <w:shd w:val="clear" w:color="auto" w:fill="D9D9D9"/>
+          </w:tcPr>
+          <w:p>
+            <w:pPr>
+              <w:suppressAutoHyphens/>
+              <w:ind w:left="142"/>
+              <w:jc w:val="center"/>
+              <w:rPr>
+                <w:rFonts w:eastAsia="Calibri"/>
+                <w:sz w:val="22"/>
+                <w:szCs w:val="22"/>
+                <w:lang w:eastAsia="en-US"/>
+              </w:rPr>
+            </w:pPr>
+            <w:r>
+              <w:rPr>
+                <w:rFonts w:eastAsia="Calibri"/>
+                <w:sz w:val="22"/>
+                <w:szCs w:val="22"/>
+                <w:lang w:eastAsia="en-US"/>
+              </w:rPr>
+              <w:t>11</w:t>
+            </w:r>
+          </w:p>
+        </w:tc>
+        <w:tc>
+          <w:tcPr>
+            <w:tcW w:w="1829" w:type="dxa"/>
+            <w:shd w:val="clear" w:color="auto" w:fill="D9D9D9"/>
+          </w:tcPr>
+          <w:p>
+            <w:pPr>
+              <w:suppressAutoHyphens/>
+              <w:ind w:left="142"/>
+              <w:jc w:val="center"/>
+              <w:rPr>
+                <w:rFonts w:eastAsia="Calibri"/>
+                <w:sz w:val="22"/>
+                <w:szCs w:val="22"/>
+                <w:lang w:eastAsia="en-US"/>
+              </w:rPr>
+            </w:pPr>
+            <w:r>
+              <w:rPr>
+                <w:rFonts w:eastAsia="Calibri"/>
+                <w:sz w:val="22"/>
+                <w:szCs w:val="22"/>
+                <w:lang w:eastAsia="en-US"/>
+              </w:rPr>
+              <w:t>PK</w:t>
+            </w:r>
+          </w:p>
+        </w:tc>
+        <w:tc>
+          <w:tcPr>
+            <w:tcW w:w="1067" w:type="dxa"/>
+            <w:shd w:val="clear" w:color="auto" w:fill="D9D9D9"/>
+          </w:tcPr>
+          <w:p>
+            <w:pPr>
+              <w:suppressAutoHyphens/>
+              <w:ind w:left="142"/>
+              <w:jc w:val="center"/>
+              <w:rPr>
+                <w:rFonts w:eastAsia="Calibri"/>
+                <w:sz w:val="22"/>
+                <w:szCs w:val="22"/>
+                <w:lang w:eastAsia="en-US"/>
+              </w:rPr>
+            </w:pPr>
+            <w:r>
+              <w:rPr>
+                <w:rFonts w:eastAsia="Calibri"/>
+                <w:sz w:val="22"/>
+                <w:szCs w:val="22"/>
+                <w:lang w:eastAsia="en-US"/>
+              </w:rPr>
+              <w:t>X</w:t>
+            </w:r>
+          </w:p>
+        </w:tc>
+      </w:tr>
+      <w:tr>
+        <w:trPr>
+          <w:trHeight w:val="290"/>
+          <w:jc w:val="center"/>
+        </w:trPr>
+        <w:tc>
+          <w:tcPr>
+            <w:tcW w:w="2286" w:type="dxa"/>
+            <w:shd w:val="clear" w:color="auto" w:fill="D9D9D9"/>
+          </w:tcPr>
+          <w:p>
+            <w:pPr>
+              <w:suppressAutoHyphens/>
+              <w:ind w:left="142"/>
+              <w:rPr>
+                <w:rFonts w:eastAsia="Calibri"/>
+                <w:b/>
+                <w:bCs/>
+                <w:sz w:val="22"/>
+                <w:szCs w:val="22"/>
+              </w:rPr>
+            </w:pPr>
+            <w:r>
+              <w:rPr>
+                <w:rFonts w:eastAsia="Calibri"/>
+                <w:b/>
+                <w:bCs/>
+                <w:sz w:val="22"/>
+                <w:szCs w:val="22"/>
+              </w:rPr>
+              <w:t>Nome</w:t>
+            </w:r>
+          </w:p>
+        </w:tc>
+        <w:tc>
+          <w:tcPr>
+            <w:tcW w:w="3201" w:type="dxa"/>
+            <w:shd w:val="clear" w:color="auto" w:fill="D9D9D9"/>
+          </w:tcPr>
+          <w:p>
+            <w:pPr>
+              <w:suppressAutoHyphens/>
+              <w:ind w:left="142"/>
+              <w:jc w:val="both"/>
+              <w:rPr>
+                <w:rFonts w:eastAsia="Calibri"/>
+                <w:sz w:val="22"/>
+                <w:szCs w:val="22"/>
+              </w:rPr>
+            </w:pPr>
+            <w:proofErr w:type="spellStart"/>
+            <w:r>
+              <w:rPr>
+                <w:rFonts w:eastAsia="Calibri"/>
+                <w:sz w:val="22"/>
+                <w:szCs w:val="22"/>
+              </w:rPr>
+              <w:t>varchar</w:t>
+            </w:r>
+            <w:proofErr w:type="spellEnd"/>
+          </w:p>
+        </w:tc>
+        <w:tc>
+          <w:tcPr>
+            <w:tcW w:w="915" w:type="dxa"/>
+            <w:shd w:val="clear" w:color="auto" w:fill="D9D9D9"/>
+          </w:tcPr>
+          <w:p>
+            <w:pPr>
+              <w:suppressAutoHyphens/>
+              <w:ind w:left="142"/>
+              <w:jc w:val="center"/>
+              <w:rPr>
+                <w:rFonts w:eastAsia="Calibri"/>
+                <w:sz w:val="22"/>
+                <w:szCs w:val="22"/>
+                <w:lang w:eastAsia="en-US"/>
+              </w:rPr>
+            </w:pPr>
+            <w:r>
+              <w:rPr>
+                <w:rFonts w:eastAsia="Calibri"/>
+                <w:sz w:val="22"/>
+                <w:szCs w:val="22"/>
+                <w:lang w:eastAsia="en-US"/>
+              </w:rPr>
+              <w:t>150</w:t>
+            </w:r>
+          </w:p>
+        </w:tc>
+        <w:tc>
+          <w:tcPr>
+            <w:tcW w:w="1829" w:type="dxa"/>
+            <w:shd w:val="clear" w:color="auto" w:fill="D9D9D9"/>
+          </w:tcPr>
+          <w:p>
+            <w:pPr>
+              <w:suppressAutoHyphens/>
+              <w:ind w:left="142"/>
+              <w:jc w:val="center"/>
+              <w:rPr>
+                <w:rFonts w:eastAsia="Calibri"/>
+                <w:sz w:val="22"/>
+                <w:szCs w:val="22"/>
+                <w:lang w:eastAsia="en-US"/>
+              </w:rPr>
+            </w:pPr>
+          </w:p>
+        </w:tc>
+        <w:tc>
+          <w:tcPr>
+            <w:tcW w:w="1067" w:type="dxa"/>
+            <w:shd w:val="clear" w:color="auto" w:fill="D9D9D9"/>
+          </w:tcPr>
+          <w:p>
+            <w:pPr>
+              <w:suppressAutoHyphens/>
+              <w:ind w:left="142"/>
+              <w:jc w:val="center"/>
+              <w:rPr>
+                <w:rFonts w:eastAsia="Calibri"/>
+                <w:sz w:val="22"/>
+                <w:szCs w:val="22"/>
+                <w:lang w:eastAsia="en-US"/>
+              </w:rPr>
+            </w:pPr>
+            <w:r>
+              <w:rPr>
+                <w:rFonts w:eastAsia="Calibri"/>
+                <w:sz w:val="22"/>
+                <w:szCs w:val="22"/>
+                <w:lang w:eastAsia="en-US"/>
+              </w:rPr>
+              <w:t>X</w:t>
+            </w:r>
+          </w:p>
+        </w:tc>
+      </w:tr>
+      <w:tr>
+        <w:trPr>
+          <w:trHeight w:val="290"/>
+          <w:jc w:val="center"/>
+        </w:trPr>
+        <w:tc>
+          <w:tcPr>
+            <w:tcW w:w="2286" w:type="dxa"/>
+            <w:shd w:val="clear" w:color="auto" w:fill="D9D9D9"/>
+          </w:tcPr>
+          <w:p>
+            <w:pPr>
+              <w:suppressAutoHyphens/>
+              <w:ind w:left="142"/>
+              <w:rPr>
+                <w:rFonts w:eastAsia="Calibri"/>
+                <w:b/>
+                <w:bCs/>
+                <w:sz w:val="22"/>
+                <w:szCs w:val="22"/>
+              </w:rPr>
+            </w:pPr>
+            <w:r>
+              <w:rPr>
+                <w:rFonts w:eastAsia="Calibri"/>
+                <w:b/>
+                <w:bCs/>
+                <w:sz w:val="22"/>
+                <w:szCs w:val="22"/>
+              </w:rPr>
+              <w:t>preço</w:t>
+            </w:r>
+          </w:p>
+        </w:tc>
+        <w:tc>
+          <w:tcPr>
+            <w:tcW w:w="3201" w:type="dxa"/>
+            <w:shd w:val="clear" w:color="auto" w:fill="D9D9D9"/>
+          </w:tcPr>
+          <w:p>
+            <w:pPr>
+              <w:suppressAutoHyphens/>
+              <w:ind w:left="142"/>
+              <w:jc w:val="both"/>
+              <w:rPr>
+                <w:rFonts w:eastAsia="Calibri"/>
+                <w:sz w:val="22"/>
+                <w:szCs w:val="22"/>
+              </w:rPr>
+            </w:pPr>
+            <w:r>
+              <w:rPr>
+                <w:rFonts w:eastAsia="Calibri"/>
+                <w:sz w:val="22"/>
+                <w:szCs w:val="22"/>
+              </w:rPr>
+              <w:t>decimal</w:t>
+            </w:r>
+          </w:p>
+        </w:tc>
+        <w:tc>
+          <w:tcPr>
+            <w:tcW w:w="915" w:type="dxa"/>
+            <w:shd w:val="clear" w:color="auto" w:fill="D9D9D9"/>
+          </w:tcPr>
+          <w:p>
+            <w:pPr>
+              <w:suppressAutoHyphens/>
+              <w:ind w:left="142"/>
+              <w:jc w:val="center"/>
+              <w:rPr>
+                <w:rFonts w:eastAsia="Calibri"/>
+                <w:sz w:val="22"/>
+                <w:szCs w:val="22"/>
+                <w:lang w:eastAsia="en-US"/>
+              </w:rPr>
+            </w:pPr>
+            <w:r>
+              <w:rPr>
+                <w:rFonts w:eastAsia="Calibri"/>
+                <w:sz w:val="22"/>
+                <w:szCs w:val="22"/>
+                <w:lang w:eastAsia="en-US"/>
+              </w:rPr>
+              <w:t>10,2</w:t>
+            </w:r>
+          </w:p>
+        </w:tc>
+        <w:tc>
+          <w:tcPr>
+            <w:tcW w:w="1829" w:type="dxa"/>
+            <w:shd w:val="clear" w:color="auto" w:fill="D9D9D9"/>
+          </w:tcPr>
+          <w:p>
+            <w:pPr>
+              <w:suppressAutoHyphens/>
+              <w:ind w:left="142"/>
+              <w:jc w:val="center"/>
+              <w:rPr>
+                <w:rFonts w:eastAsia="Calibri"/>
+                <w:sz w:val="22"/>
+                <w:szCs w:val="22"/>
+                <w:lang w:eastAsia="en-US"/>
+              </w:rPr>
+            </w:pPr>
+          </w:p>
+        </w:tc>
+        <w:tc>
+          <w:tcPr>
+            <w:tcW w:w="1067" w:type="dxa"/>
+            <w:shd w:val="clear" w:color="auto" w:fill="D9D9D9"/>
+          </w:tcPr>
+          <w:p>
+            <w:pPr>
+              <w:suppressAutoHyphens/>
+              <w:ind w:left="142"/>
+              <w:jc w:val="center"/>
+              <w:rPr>
+                <w:rFonts w:eastAsia="Calibri"/>
+                <w:sz w:val="22"/>
+                <w:szCs w:val="22"/>
+                <w:lang w:eastAsia="en-US"/>
+              </w:rPr>
+            </w:pPr>
+            <w:r>
+              <w:rPr>
+                <w:rFonts w:eastAsia="Calibri"/>
+                <w:sz w:val="22"/>
+                <w:szCs w:val="22"/>
+                <w:lang w:eastAsia="en-US"/>
+              </w:rPr>
+              <w:t>X</w:t>
+            </w:r>
+          </w:p>
+        </w:tc>
+      </w:tr>
+      <w:tr>
+        <w:trPr>
+          <w:trHeight w:val="290"/>
+          <w:jc w:val="center"/>
+        </w:trPr>
+        <w:tc>
+          <w:tcPr>
+            <w:tcW w:w="2286" w:type="dxa"/>
+            <w:shd w:val="clear" w:color="auto" w:fill="D9D9D9"/>
+          </w:tcPr>
+          <w:p>
+            <w:pPr>
+              <w:suppressAutoHyphens/>
+              <w:ind w:left="142"/>
+              <w:rPr>
+                <w:rFonts w:eastAsia="Calibri"/>
+                <w:b/>
+                <w:bCs/>
+                <w:sz w:val="22"/>
+                <w:szCs w:val="22"/>
+              </w:rPr>
+            </w:pPr>
+            <w:r>
+              <w:rPr>
+                <w:rFonts w:eastAsia="Calibri"/>
+                <w:b/>
+                <w:bCs/>
+                <w:sz w:val="22"/>
+                <w:szCs w:val="22"/>
+              </w:rPr>
+              <w:t>categoria</w:t>
+            </w:r>
+          </w:p>
+        </w:tc>
+        <w:tc>
+          <w:tcPr>
+            <w:tcW w:w="3201" w:type="dxa"/>
+            <w:shd w:val="clear" w:color="auto" w:fill="D9D9D9"/>
+          </w:tcPr>
+          <w:p>
+            <w:pPr>
+              <w:suppressAutoHyphens/>
+              <w:ind w:left="142"/>
+              <w:jc w:val="both"/>
+              <w:rPr>
+                <w:rFonts w:eastAsia="Calibri"/>
+                <w:sz w:val="22"/>
+                <w:szCs w:val="22"/>
+              </w:rPr>
+            </w:pPr>
+            <w:proofErr w:type="spellStart"/>
+            <w:r>
+              <w:rPr>
+                <w:rFonts w:eastAsia="Calibri"/>
+                <w:sz w:val="22"/>
+                <w:szCs w:val="22"/>
+              </w:rPr>
+              <w:t>varchar</w:t>
+            </w:r>
+            <w:proofErr w:type="spellEnd"/>
+          </w:p>
+        </w:tc>
+        <w:tc>
+          <w:tcPr>
+            <w:tcW w:w="915" w:type="dxa"/>
+            <w:shd w:val="clear" w:color="auto" w:fill="D9D9D9"/>
+          </w:tcPr>
+          <w:p>
+            <w:pPr>
+              <w:suppressAutoHyphens/>
+              <w:ind w:left="142"/>
+              <w:jc w:val="center"/>
+              <w:rPr>
+                <w:rFonts w:eastAsia="Calibri"/>
+                <w:sz w:val="22"/>
+                <w:szCs w:val="22"/>
+                <w:lang w:eastAsia="en-US"/>
+              </w:rPr>
+            </w:pPr>
+            <w:r>
+              <w:rPr>
+                <w:rFonts w:eastAsia="Calibri"/>
+                <w:sz w:val="22"/>
+                <w:szCs w:val="22"/>
+                <w:lang w:eastAsia="en-US"/>
+              </w:rPr>
+              <w:t>100</w:t>
+            </w:r>
+          </w:p>
+        </w:tc>
+        <w:tc>
+          <w:tcPr>
+            <w:tcW w:w="1829" w:type="dxa"/>
+            <w:shd w:val="clear" w:color="auto" w:fill="D9D9D9"/>
+          </w:tcPr>
+          <w:p>
+            <w:pPr>
+              <w:suppressAutoHyphens/>
+              <w:ind w:left="142"/>
+              <w:jc w:val="center"/>
+              <w:rPr>
+                <w:rFonts w:eastAsia="Calibri"/>
+                <w:sz w:val="22"/>
+                <w:szCs w:val="22"/>
+                <w:lang w:eastAsia="en-US"/>
+              </w:rPr>
+            </w:pPr>
+          </w:p>
+        </w:tc>
+        <w:tc>
+          <w:tcPr>
+            <w:tcW w:w="1067" w:type="dxa"/>
+            <w:shd w:val="clear" w:color="auto" w:fill="D9D9D9"/>
+          </w:tcPr>
+          <w:p>
+            <w:pPr>
+              <w:suppressAutoHyphens/>
+              <w:ind w:left="142"/>
+              <w:jc w:val="center"/>
+              <w:rPr>
+                <w:rFonts w:eastAsia="Calibri"/>
+                <w:sz w:val="22"/>
+                <w:szCs w:val="22"/>
+                <w:lang w:eastAsia="en-US"/>
+              </w:rPr>
+            </w:pPr>
+            <w:r>
+              <w:rPr>
+                <w:rFonts w:eastAsia="Calibri"/>
+                <w:sz w:val="22"/>
+                <w:szCs w:val="22"/>
+                <w:lang w:eastAsia="en-US"/>
+              </w:rPr>
+              <w:t>X</w:t>
+            </w:r>
+          </w:p>
+        </w:tc>
+      </w:tr>
+      <w:tr>
+        <w:trPr>
+          <w:trHeight w:val="290"/>
+          <w:jc w:val="center"/>
+        </w:trPr>
+        <w:tc>
+          <w:tcPr>
+            <w:tcW w:w="2286" w:type="dxa"/>
+            <w:shd w:val="clear" w:color="auto" w:fill="D9D9D9"/>
+          </w:tcPr>
+          <w:p>
+            <w:pPr>
+              <w:suppressAutoHyphens/>
+              <w:ind w:left="142"/>
+              <w:rPr>
+                <w:rFonts w:eastAsia="Calibri"/>
+                <w:b/>
+                <w:bCs/>
+                <w:sz w:val="22"/>
+                <w:szCs w:val="22"/>
+              </w:rPr>
+            </w:pPr>
+            <w:r>
+              <w:rPr>
+                <w:rFonts w:eastAsia="Calibri"/>
+                <w:b/>
+                <w:bCs/>
+                <w:sz w:val="22"/>
+                <w:szCs w:val="22"/>
+              </w:rPr>
+              <w:t>descrição</w:t>
+            </w:r>
+          </w:p>
+        </w:tc>
+        <w:tc>
+          <w:tcPr>
+            <w:tcW w:w="3201" w:type="dxa"/>
+            <w:shd w:val="clear" w:color="auto" w:fill="D9D9D9"/>
+          </w:tcPr>
+          <w:p>
+            <w:pPr>
+              <w:suppressAutoHyphens/>
+              <w:ind w:left="142"/>
+              <w:jc w:val="both"/>
+              <w:rPr>
+                <w:rFonts w:eastAsia="Calibri"/>
+                <w:sz w:val="22"/>
+                <w:szCs w:val="22"/>
+              </w:rPr>
+            </w:pPr>
+            <w:proofErr w:type="spellStart"/>
+            <w:r>
+              <w:rPr>
+                <w:rFonts w:eastAsia="Calibri"/>
+                <w:sz w:val="22"/>
+                <w:szCs w:val="22"/>
+              </w:rPr>
+              <w:t>text</w:t>
+            </w:r>
+            <w:proofErr w:type="spellEnd"/>
+          </w:p>
+        </w:tc>
+        <w:tc>
+          <w:tcPr>
+            <w:tcW w:w="915" w:type="dxa"/>
+            <w:shd w:val="clear" w:color="auto" w:fill="D9D9D9"/>
+          </w:tcPr>
+          <w:p>
+            <w:pPr>
+              <w:suppressAutoHyphens/>
+              <w:ind w:left="142"/>
+              <w:jc w:val="center"/>
+              <w:rPr>
+                <w:rFonts w:eastAsia="Calibri"/>
+                <w:sz w:val="22"/>
+                <w:szCs w:val="22"/>
+                <w:lang w:eastAsia="en-US"/>
+              </w:rPr>
+            </w:pPr>
+          </w:p>
+        </w:tc>
+        <w:tc>
+          <w:tcPr>
+            <w:tcW w:w="1829" w:type="dxa"/>
+            <w:shd w:val="clear" w:color="auto" w:fill="D9D9D9"/>
+          </w:tcPr>
+          <w:p>
+            <w:pPr>
+              <w:suppressAutoHyphens/>
+              <w:ind w:left="142"/>
+              <w:jc w:val="center"/>
+              <w:rPr>
+                <w:rFonts w:eastAsia="Calibri"/>
+                <w:sz w:val="22"/>
+                <w:szCs w:val="22"/>
+                <w:lang w:eastAsia="en-US"/>
+              </w:rPr>
+            </w:pPr>
+          </w:p>
+        </w:tc>
+        <w:tc>
+          <w:tcPr>
+            <w:tcW w:w="1067" w:type="dxa"/>
+            <w:shd w:val="clear" w:color="auto" w:fill="D9D9D9"/>
+          </w:tcPr>
+          <w:p>
+            <w:pPr>
+              <w:suppressAutoHyphens/>
+              <w:ind w:left="142"/>
+              <w:jc w:val="center"/>
+              <w:rPr>
+                <w:rFonts w:eastAsia="Calibri"/>
+                <w:sz w:val="22"/>
+                <w:szCs w:val="22"/>
+                <w:lang w:eastAsia="en-US"/>
+              </w:rPr>
+            </w:pPr>
+            <w:r>
+              <w:rPr>
+                <w:rFonts w:eastAsia="Calibri"/>
+                <w:sz w:val="22"/>
+                <w:szCs w:val="22"/>
+                <w:lang w:eastAsia="en-US"/>
+              </w:rPr>
+              <w:t>X</w:t>
+            </w:r>
+          </w:p>
+        </w:tc>
+      </w:tr>
+    </w:tbl>
     <w:p>
       <w:pPr>
-        <w:jc w:val="both"/>
+        <w:rPr>
+          <w:color w:val="0000FF"/>
+        </w:rPr>
       </w:pPr>
     </w:p>
     <w:p>
       <w:pPr>
-        <w:pStyle w:val="Ttulo3"/>
-        <w:rPr>
-          <w:bCs/>
-        </w:rPr>
-      </w:pPr>
-      <w:bookmarkStart w:id="9" w:name="_Toc418788951"/>
-      <w:bookmarkStart w:id="10" w:name="_Toc432543226"/>
+        <w:pStyle w:val="Commarcadores"/>
+        <w:tabs>
+          <w:tab w:val="num" w:pos="360"/>
+        </w:tabs>
+        <w:spacing w:before="0" w:after="200" w:line="276" w:lineRule="auto"/>
+        <w:ind w:left="360" w:hanging="360"/>
+        <w:contextualSpacing/>
+        <w:jc w:val="left"/>
+      </w:pPr>
+    </w:p>
+    <w:p>
+      <w:pPr>
+        <w:pStyle w:val="Commarcadores"/>
+        <w:tabs>
+          <w:tab w:val="num" w:pos="360"/>
+        </w:tabs>
+        <w:spacing w:before="0" w:after="200" w:line="276" w:lineRule="auto"/>
+        <w:ind w:left="360" w:hanging="360"/>
+        <w:contextualSpacing/>
+        <w:jc w:val="left"/>
+      </w:pPr>
       <w:r>
-        <w:rPr>
-          <w:bCs/>
-        </w:rPr>
-        <w:t>O Projeto consiste na criação de um sistema web voltado à parte</w:t>
-      </w:r>
-      <w:r>
-        <w:rPr>
-          <w:bCs/>
-        </w:rPr>
-        <w:t xml:space="preserve"> de</w:t>
-      </w:r>
-      <w:r>
-        <w:rPr>
-          <w:bCs/>
-        </w:rPr>
-        <w:t xml:space="preserve"> </w:t>
-      </w:r>
-      <w:r>
-        <w:rPr>
-          <w:bCs/>
-        </w:rPr>
-        <w:t xml:space="preserve">Home, </w:t>
-      </w:r>
-      <w:proofErr w:type="gramStart"/>
-      <w:r>
-        <w:rPr>
-          <w:bCs/>
-        </w:rPr>
-        <w:t>Quem</w:t>
-      </w:r>
-      <w:proofErr w:type="gramEnd"/>
-      <w:r>
-        <w:rPr>
-          <w:bCs/>
-        </w:rPr>
-        <w:t xml:space="preserve"> somos, Produtos, Serviços e Login</w:t>
-      </w:r>
-      <w:r>
-        <w:rPr>
-          <w:bCs/>
-        </w:rPr>
-        <w:t xml:space="preserve">. </w:t>
-      </w:r>
-      <w:bookmarkEnd w:id="9"/>
-      <w:bookmarkEnd w:id="10"/>
-      <w:r>
-        <w:rPr>
-          <w:bCs/>
-        </w:rPr>
-        <w:t xml:space="preserve">O sistema vai permitir que o cliente acessando a página de serviço consiga agendar um serviço fornecido pela barbearia, na página produtos o cliente poderá adquirir produtos </w:t>
-      </w:r>
-      <w:proofErr w:type="spellStart"/>
-      <w:r>
-        <w:rPr>
-          <w:bCs/>
-        </w:rPr>
-        <w:t>realacionado</w:t>
-      </w:r>
-      <w:proofErr w:type="spellEnd"/>
-      <w:r>
-        <w:rPr>
-          <w:bCs/>
-        </w:rPr>
-        <w:t xml:space="preserve"> a estética e perfumaria, na página de login o Administrador poderá acessar ao banco de dados que terá os agendamentos e os produtos comprado.</w:t>
+        <w:t>Definição de tabela de serviço</w:t>
       </w:r>
     </w:p>
+    <w:tbl>
+      <w:tblPr>
+        <w:tblW w:w="9298" w:type="dxa"/>
+        <w:jc w:val="center"/>
+        <w:tblBorders>
+          <w:top w:val="single" w:sz="8" w:space="0" w:color="404040"/>
+          <w:left w:val="single" w:sz="8" w:space="0" w:color="404040"/>
+          <w:bottom w:val="single" w:sz="8" w:space="0" w:color="404040"/>
+          <w:right w:val="single" w:sz="8" w:space="0" w:color="404040"/>
+          <w:insideH w:val="single" w:sz="8" w:space="0" w:color="404040"/>
+          <w:insideV w:val="single" w:sz="8" w:space="0" w:color="404040"/>
+        </w:tblBorders>
+        <w:shd w:val="clear" w:color="auto" w:fill="D9D9D9"/>
+        <w:tblLayout w:type="fixed"/>
+        <w:tblLook w:val="04A0" w:firstRow="1" w:lastRow="0" w:firstColumn="1" w:lastColumn="0" w:noHBand="0" w:noVBand="1"/>
+      </w:tblPr>
+      <w:tblGrid>
+        <w:gridCol w:w="2286"/>
+        <w:gridCol w:w="3201"/>
+        <w:gridCol w:w="915"/>
+        <w:gridCol w:w="1829"/>
+        <w:gridCol w:w="1067"/>
+      </w:tblGrid>
+      <w:tr>
+        <w:trPr>
+          <w:trHeight w:val="217"/>
+          <w:jc w:val="center"/>
+        </w:trPr>
+        <w:tc>
+          <w:tcPr>
+            <w:tcW w:w="2286" w:type="dxa"/>
+            <w:shd w:val="clear" w:color="auto" w:fill="D9D9D9"/>
+          </w:tcPr>
+          <w:p>
+            <w:pPr>
+              <w:suppressAutoHyphens/>
+              <w:ind w:left="142"/>
+              <w:jc w:val="center"/>
+              <w:rPr>
+                <w:rFonts w:eastAsia="Calibri"/>
+                <w:b/>
+                <w:bCs/>
+                <w:sz w:val="22"/>
+                <w:szCs w:val="22"/>
+              </w:rPr>
+            </w:pPr>
+            <w:r>
+              <w:rPr>
+                <w:rFonts w:eastAsia="Calibri"/>
+                <w:b/>
+                <w:bCs/>
+                <w:sz w:val="22"/>
+                <w:szCs w:val="22"/>
+              </w:rPr>
+              <w:t>Atributo</w:t>
+            </w:r>
+          </w:p>
+        </w:tc>
+        <w:tc>
+          <w:tcPr>
+            <w:tcW w:w="3201" w:type="dxa"/>
+            <w:shd w:val="clear" w:color="auto" w:fill="D9D9D9"/>
+          </w:tcPr>
+          <w:p>
+            <w:pPr>
+              <w:suppressAutoHyphens/>
+              <w:ind w:left="142"/>
+              <w:jc w:val="center"/>
+              <w:rPr>
+                <w:rFonts w:eastAsia="Calibri"/>
+                <w:b/>
+                <w:sz w:val="22"/>
+                <w:szCs w:val="22"/>
+              </w:rPr>
+            </w:pPr>
+            <w:r>
+              <w:rPr>
+                <w:rFonts w:eastAsia="Calibri"/>
+                <w:b/>
+                <w:sz w:val="22"/>
+                <w:szCs w:val="22"/>
+              </w:rPr>
+              <w:t>Tipo</w:t>
+            </w:r>
+          </w:p>
+        </w:tc>
+        <w:tc>
+          <w:tcPr>
+            <w:tcW w:w="915" w:type="dxa"/>
+            <w:shd w:val="clear" w:color="auto" w:fill="D9D9D9"/>
+          </w:tcPr>
+          <w:p>
+            <w:pPr>
+              <w:suppressAutoHyphens/>
+              <w:ind w:left="142"/>
+              <w:jc w:val="center"/>
+              <w:rPr>
+                <w:rFonts w:eastAsia="Calibri"/>
+                <w:b/>
+                <w:sz w:val="22"/>
+                <w:szCs w:val="22"/>
+              </w:rPr>
+            </w:pPr>
+            <w:r>
+              <w:rPr>
+                <w:rFonts w:eastAsia="Calibri"/>
+                <w:b/>
+                <w:sz w:val="22"/>
+                <w:szCs w:val="22"/>
+              </w:rPr>
+              <w:t>Tam.</w:t>
+            </w:r>
+          </w:p>
+        </w:tc>
+        <w:tc>
+          <w:tcPr>
+            <w:tcW w:w="1829" w:type="dxa"/>
+            <w:shd w:val="clear" w:color="auto" w:fill="D9D9D9"/>
+          </w:tcPr>
+          <w:p>
+            <w:pPr>
+              <w:suppressAutoHyphens/>
+              <w:ind w:left="142"/>
+              <w:jc w:val="center"/>
+              <w:rPr>
+                <w:rFonts w:eastAsia="Calibri"/>
+                <w:b/>
+                <w:sz w:val="22"/>
+                <w:szCs w:val="22"/>
+              </w:rPr>
+            </w:pPr>
+            <w:r>
+              <w:rPr>
+                <w:rFonts w:eastAsia="Calibri"/>
+                <w:b/>
+                <w:sz w:val="22"/>
+                <w:szCs w:val="22"/>
+              </w:rPr>
+              <w:t>Máscara</w:t>
+            </w:r>
+          </w:p>
+        </w:tc>
+        <w:tc>
+          <w:tcPr>
+            <w:tcW w:w="1067" w:type="dxa"/>
+            <w:shd w:val="clear" w:color="auto" w:fill="D9D9D9"/>
+          </w:tcPr>
+          <w:p>
+            <w:pPr>
+              <w:suppressAutoHyphens/>
+              <w:ind w:left="142"/>
+              <w:jc w:val="center"/>
+              <w:rPr>
+                <w:rFonts w:eastAsia="Calibri"/>
+                <w:b/>
+                <w:sz w:val="22"/>
+                <w:szCs w:val="22"/>
+              </w:rPr>
+            </w:pPr>
+            <w:proofErr w:type="spellStart"/>
+            <w:r>
+              <w:rPr>
+                <w:rFonts w:eastAsia="Calibri"/>
+                <w:b/>
+                <w:sz w:val="22"/>
+                <w:szCs w:val="22"/>
+              </w:rPr>
+              <w:t>Obrig</w:t>
+            </w:r>
+            <w:proofErr w:type="spellEnd"/>
+            <w:r>
+              <w:rPr>
+                <w:rFonts w:eastAsia="Calibri"/>
+                <w:b/>
+                <w:sz w:val="22"/>
+                <w:szCs w:val="22"/>
+              </w:rPr>
+              <w:t>.</w:t>
+            </w:r>
+          </w:p>
+        </w:tc>
+      </w:tr>
+      <w:tr>
+        <w:trPr>
+          <w:trHeight w:val="241"/>
+          <w:jc w:val="center"/>
+        </w:trPr>
+        <w:tc>
+          <w:tcPr>
+            <w:tcW w:w="2286" w:type="dxa"/>
+            <w:shd w:val="clear" w:color="auto" w:fill="D9D9D9"/>
+          </w:tcPr>
+          <w:p>
+            <w:pPr>
+              <w:suppressAutoHyphens/>
+              <w:ind w:left="142"/>
+              <w:rPr>
+                <w:rFonts w:eastAsia="Calibri"/>
+                <w:b/>
+                <w:bCs/>
+                <w:sz w:val="22"/>
+                <w:szCs w:val="22"/>
+              </w:rPr>
+            </w:pPr>
+            <w:r>
+              <w:rPr>
+                <w:rFonts w:eastAsia="Calibri"/>
+                <w:b/>
+                <w:bCs/>
+                <w:sz w:val="22"/>
+                <w:szCs w:val="22"/>
+              </w:rPr>
+              <w:t>ID</w:t>
+            </w:r>
+          </w:p>
+        </w:tc>
+        <w:tc>
+          <w:tcPr>
+            <w:tcW w:w="3201" w:type="dxa"/>
+            <w:shd w:val="clear" w:color="auto" w:fill="D9D9D9"/>
+          </w:tcPr>
+          <w:p>
+            <w:pPr>
+              <w:suppressAutoHyphens/>
+              <w:ind w:left="142"/>
+              <w:rPr>
+                <w:rFonts w:eastAsia="Calibri"/>
+                <w:sz w:val="22"/>
+                <w:szCs w:val="22"/>
+                <w:lang w:eastAsia="en-US"/>
+              </w:rPr>
+            </w:pPr>
+            <w:proofErr w:type="spellStart"/>
+            <w:r>
+              <w:rPr>
+                <w:rFonts w:eastAsia="Calibri"/>
+                <w:sz w:val="22"/>
+                <w:szCs w:val="22"/>
+                <w:lang w:eastAsia="en-US"/>
+              </w:rPr>
+              <w:t>Int</w:t>
+            </w:r>
+            <w:proofErr w:type="spellEnd"/>
+          </w:p>
+        </w:tc>
+        <w:tc>
+          <w:tcPr>
+            <w:tcW w:w="915" w:type="dxa"/>
+            <w:shd w:val="clear" w:color="auto" w:fill="D9D9D9"/>
+          </w:tcPr>
+          <w:p>
+            <w:pPr>
+              <w:suppressAutoHyphens/>
+              <w:ind w:left="142"/>
+              <w:jc w:val="center"/>
+              <w:rPr>
+                <w:rFonts w:eastAsia="Calibri"/>
+                <w:sz w:val="22"/>
+                <w:szCs w:val="22"/>
+                <w:lang w:eastAsia="en-US"/>
+              </w:rPr>
+            </w:pPr>
+            <w:r>
+              <w:rPr>
+                <w:rFonts w:eastAsia="Calibri"/>
+                <w:sz w:val="22"/>
+                <w:szCs w:val="22"/>
+                <w:lang w:eastAsia="en-US"/>
+              </w:rPr>
+              <w:t>11</w:t>
+            </w:r>
+          </w:p>
+        </w:tc>
+        <w:tc>
+          <w:tcPr>
+            <w:tcW w:w="1829" w:type="dxa"/>
+            <w:shd w:val="clear" w:color="auto" w:fill="D9D9D9"/>
+          </w:tcPr>
+          <w:p>
+            <w:pPr>
+              <w:suppressAutoHyphens/>
+              <w:ind w:left="142"/>
+              <w:jc w:val="center"/>
+              <w:rPr>
+                <w:rFonts w:eastAsia="Calibri"/>
+                <w:sz w:val="22"/>
+                <w:szCs w:val="22"/>
+                <w:lang w:eastAsia="en-US"/>
+              </w:rPr>
+            </w:pPr>
+            <w:r>
+              <w:rPr>
+                <w:rFonts w:eastAsia="Calibri"/>
+                <w:sz w:val="22"/>
+                <w:szCs w:val="22"/>
+                <w:lang w:eastAsia="en-US"/>
+              </w:rPr>
+              <w:t>PK</w:t>
+            </w:r>
+          </w:p>
+        </w:tc>
+        <w:tc>
+          <w:tcPr>
+            <w:tcW w:w="1067" w:type="dxa"/>
+            <w:shd w:val="clear" w:color="auto" w:fill="D9D9D9"/>
+          </w:tcPr>
+          <w:p>
+            <w:pPr>
+              <w:suppressAutoHyphens/>
+              <w:ind w:left="142"/>
+              <w:jc w:val="center"/>
+              <w:rPr>
+                <w:rFonts w:eastAsia="Calibri"/>
+                <w:sz w:val="22"/>
+                <w:szCs w:val="22"/>
+                <w:lang w:eastAsia="en-US"/>
+              </w:rPr>
+            </w:pPr>
+            <w:r>
+              <w:rPr>
+                <w:rFonts w:eastAsia="Calibri"/>
+                <w:sz w:val="22"/>
+                <w:szCs w:val="22"/>
+                <w:lang w:eastAsia="en-US"/>
+              </w:rPr>
+              <w:t>X</w:t>
+            </w:r>
+          </w:p>
+        </w:tc>
+      </w:tr>
+      <w:tr>
+        <w:trPr>
+          <w:trHeight w:val="290"/>
+          <w:jc w:val="center"/>
+        </w:trPr>
+        <w:tc>
+          <w:tcPr>
+            <w:tcW w:w="2286" w:type="dxa"/>
+            <w:shd w:val="clear" w:color="auto" w:fill="D9D9D9"/>
+          </w:tcPr>
+          <w:p>
+            <w:pPr>
+              <w:suppressAutoHyphens/>
+              <w:ind w:left="142"/>
+              <w:rPr>
+                <w:rFonts w:eastAsia="Calibri"/>
+                <w:b/>
+                <w:bCs/>
+                <w:sz w:val="22"/>
+                <w:szCs w:val="22"/>
+              </w:rPr>
+            </w:pPr>
+            <w:r>
+              <w:rPr>
+                <w:rFonts w:eastAsia="Calibri"/>
+                <w:b/>
+                <w:bCs/>
+                <w:sz w:val="22"/>
+                <w:szCs w:val="22"/>
+              </w:rPr>
+              <w:t>Serviço</w:t>
+            </w:r>
+          </w:p>
+        </w:tc>
+        <w:tc>
+          <w:tcPr>
+            <w:tcW w:w="3201" w:type="dxa"/>
+            <w:shd w:val="clear" w:color="auto" w:fill="D9D9D9"/>
+          </w:tcPr>
+          <w:p>
+            <w:pPr>
+              <w:suppressAutoHyphens/>
+              <w:ind w:left="142"/>
+              <w:jc w:val="both"/>
+              <w:rPr>
+                <w:rFonts w:eastAsia="Calibri"/>
+                <w:sz w:val="22"/>
+                <w:szCs w:val="22"/>
+              </w:rPr>
+            </w:pPr>
+            <w:proofErr w:type="spellStart"/>
+            <w:r>
+              <w:rPr>
+                <w:rFonts w:eastAsia="Calibri"/>
+                <w:sz w:val="22"/>
+                <w:szCs w:val="22"/>
+              </w:rPr>
+              <w:t>varchar</w:t>
+            </w:r>
+            <w:proofErr w:type="spellEnd"/>
+          </w:p>
+        </w:tc>
+        <w:tc>
+          <w:tcPr>
+            <w:tcW w:w="915" w:type="dxa"/>
+            <w:shd w:val="clear" w:color="auto" w:fill="D9D9D9"/>
+          </w:tcPr>
+          <w:p>
+            <w:pPr>
+              <w:suppressAutoHyphens/>
+              <w:ind w:left="142"/>
+              <w:jc w:val="center"/>
+              <w:rPr>
+                <w:rFonts w:eastAsia="Calibri"/>
+                <w:sz w:val="22"/>
+                <w:szCs w:val="22"/>
+                <w:lang w:eastAsia="en-US"/>
+              </w:rPr>
+            </w:pPr>
+            <w:r>
+              <w:rPr>
+                <w:rFonts w:eastAsia="Calibri"/>
+                <w:sz w:val="22"/>
+                <w:szCs w:val="22"/>
+                <w:lang w:eastAsia="en-US"/>
+              </w:rPr>
+              <w:t>150</w:t>
+            </w:r>
+          </w:p>
+        </w:tc>
+        <w:tc>
+          <w:tcPr>
+            <w:tcW w:w="1829" w:type="dxa"/>
+            <w:shd w:val="clear" w:color="auto" w:fill="D9D9D9"/>
+          </w:tcPr>
+          <w:p>
+            <w:pPr>
+              <w:suppressAutoHyphens/>
+              <w:ind w:left="142"/>
+              <w:jc w:val="center"/>
+              <w:rPr>
+                <w:rFonts w:eastAsia="Calibri"/>
+                <w:sz w:val="22"/>
+                <w:szCs w:val="22"/>
+                <w:lang w:eastAsia="en-US"/>
+              </w:rPr>
+            </w:pPr>
+          </w:p>
+        </w:tc>
+        <w:tc>
+          <w:tcPr>
+            <w:tcW w:w="1067" w:type="dxa"/>
+            <w:shd w:val="clear" w:color="auto" w:fill="D9D9D9"/>
+          </w:tcPr>
+          <w:p>
+            <w:pPr>
+              <w:suppressAutoHyphens/>
+              <w:ind w:left="142"/>
+              <w:jc w:val="center"/>
+              <w:rPr>
+                <w:rFonts w:eastAsia="Calibri"/>
+                <w:sz w:val="22"/>
+                <w:szCs w:val="22"/>
+                <w:lang w:eastAsia="en-US"/>
+              </w:rPr>
+            </w:pPr>
+            <w:r>
+              <w:rPr>
+                <w:rFonts w:eastAsia="Calibri"/>
+                <w:sz w:val="22"/>
+                <w:szCs w:val="22"/>
+                <w:lang w:eastAsia="en-US"/>
+              </w:rPr>
+              <w:t>X</w:t>
+            </w:r>
+          </w:p>
+        </w:tc>
+      </w:tr>
+      <w:tr>
+        <w:trPr>
+          <w:trHeight w:val="290"/>
+          <w:jc w:val="center"/>
+        </w:trPr>
+        <w:tc>
+          <w:tcPr>
+            <w:tcW w:w="2286" w:type="dxa"/>
+            <w:shd w:val="clear" w:color="auto" w:fill="D9D9D9"/>
+          </w:tcPr>
+          <w:p>
+            <w:pPr>
+              <w:suppressAutoHyphens/>
+              <w:ind w:left="142"/>
+              <w:rPr>
+                <w:rFonts w:eastAsia="Calibri"/>
+                <w:b/>
+                <w:bCs/>
+                <w:sz w:val="22"/>
+                <w:szCs w:val="22"/>
+              </w:rPr>
+            </w:pPr>
+            <w:r>
+              <w:rPr>
+                <w:rFonts w:eastAsia="Calibri"/>
+                <w:b/>
+                <w:bCs/>
+                <w:sz w:val="22"/>
+                <w:szCs w:val="22"/>
+              </w:rPr>
+              <w:t>Preço</w:t>
+            </w:r>
+          </w:p>
+        </w:tc>
+        <w:tc>
+          <w:tcPr>
+            <w:tcW w:w="3201" w:type="dxa"/>
+            <w:shd w:val="clear" w:color="auto" w:fill="D9D9D9"/>
+          </w:tcPr>
+          <w:p>
+            <w:pPr>
+              <w:suppressAutoHyphens/>
+              <w:ind w:left="142"/>
+              <w:jc w:val="both"/>
+              <w:rPr>
+                <w:rFonts w:eastAsia="Calibri"/>
+                <w:sz w:val="22"/>
+                <w:szCs w:val="22"/>
+              </w:rPr>
+            </w:pPr>
+            <w:r>
+              <w:rPr>
+                <w:rFonts w:eastAsia="Calibri"/>
+                <w:sz w:val="22"/>
+                <w:szCs w:val="22"/>
+              </w:rPr>
+              <w:t>decimal</w:t>
+            </w:r>
+          </w:p>
+        </w:tc>
+        <w:tc>
+          <w:tcPr>
+            <w:tcW w:w="915" w:type="dxa"/>
+            <w:shd w:val="clear" w:color="auto" w:fill="D9D9D9"/>
+          </w:tcPr>
+          <w:p>
+            <w:pPr>
+              <w:suppressAutoHyphens/>
+              <w:ind w:left="142"/>
+              <w:jc w:val="center"/>
+              <w:rPr>
+                <w:rFonts w:eastAsia="Calibri"/>
+                <w:sz w:val="22"/>
+                <w:szCs w:val="22"/>
+                <w:lang w:eastAsia="en-US"/>
+              </w:rPr>
+            </w:pPr>
+            <w:r>
+              <w:rPr>
+                <w:rFonts w:eastAsia="Calibri"/>
+                <w:sz w:val="22"/>
+                <w:szCs w:val="22"/>
+                <w:lang w:eastAsia="en-US"/>
+              </w:rPr>
+              <w:t>1</w:t>
+            </w:r>
+            <w:r>
+              <w:rPr>
+                <w:rFonts w:eastAsia="Calibri"/>
+                <w:sz w:val="22"/>
+                <w:szCs w:val="22"/>
+                <w:lang w:eastAsia="en-US"/>
+              </w:rPr>
+              <w:t>0,2</w:t>
+            </w:r>
+          </w:p>
+        </w:tc>
+        <w:tc>
+          <w:tcPr>
+            <w:tcW w:w="1829" w:type="dxa"/>
+            <w:shd w:val="clear" w:color="auto" w:fill="D9D9D9"/>
+          </w:tcPr>
+          <w:p>
+            <w:pPr>
+              <w:suppressAutoHyphens/>
+              <w:ind w:left="142"/>
+              <w:jc w:val="center"/>
+              <w:rPr>
+                <w:rFonts w:eastAsia="Calibri"/>
+                <w:sz w:val="22"/>
+                <w:szCs w:val="22"/>
+                <w:lang w:eastAsia="en-US"/>
+              </w:rPr>
+            </w:pPr>
+          </w:p>
+        </w:tc>
+        <w:tc>
+          <w:tcPr>
+            <w:tcW w:w="1067" w:type="dxa"/>
+            <w:shd w:val="clear" w:color="auto" w:fill="D9D9D9"/>
+          </w:tcPr>
+          <w:p>
+            <w:pPr>
+              <w:suppressAutoHyphens/>
+              <w:ind w:left="142"/>
+              <w:jc w:val="center"/>
+              <w:rPr>
+                <w:rFonts w:eastAsia="Calibri"/>
+                <w:sz w:val="22"/>
+                <w:szCs w:val="22"/>
+                <w:lang w:eastAsia="en-US"/>
+              </w:rPr>
+            </w:pPr>
+            <w:r>
+              <w:rPr>
+                <w:rFonts w:eastAsia="Calibri"/>
+                <w:sz w:val="22"/>
+                <w:szCs w:val="22"/>
+                <w:lang w:eastAsia="en-US"/>
+              </w:rPr>
+              <w:t>X</w:t>
+            </w:r>
+          </w:p>
+        </w:tc>
+      </w:tr>
+      <w:tr>
+        <w:trPr>
+          <w:trHeight w:val="290"/>
+          <w:jc w:val="center"/>
+        </w:trPr>
+        <w:tc>
+          <w:tcPr>
+            <w:tcW w:w="2286" w:type="dxa"/>
+            <w:shd w:val="clear" w:color="auto" w:fill="D9D9D9"/>
+          </w:tcPr>
+          <w:p>
+            <w:pPr>
+              <w:suppressAutoHyphens/>
+              <w:ind w:left="142"/>
+              <w:rPr>
+                <w:rFonts w:eastAsia="Calibri"/>
+                <w:b/>
+                <w:bCs/>
+                <w:sz w:val="22"/>
+                <w:szCs w:val="22"/>
+              </w:rPr>
+            </w:pPr>
+            <w:r>
+              <w:rPr>
+                <w:rFonts w:eastAsia="Calibri"/>
+                <w:b/>
+                <w:bCs/>
+                <w:sz w:val="22"/>
+                <w:szCs w:val="22"/>
+              </w:rPr>
+              <w:t>descrição</w:t>
+            </w:r>
+          </w:p>
+        </w:tc>
+        <w:tc>
+          <w:tcPr>
+            <w:tcW w:w="3201" w:type="dxa"/>
+            <w:shd w:val="clear" w:color="auto" w:fill="D9D9D9"/>
+          </w:tcPr>
+          <w:p>
+            <w:pPr>
+              <w:suppressAutoHyphens/>
+              <w:ind w:left="142"/>
+              <w:jc w:val="both"/>
+              <w:rPr>
+                <w:rFonts w:eastAsia="Calibri"/>
+                <w:sz w:val="22"/>
+                <w:szCs w:val="22"/>
+              </w:rPr>
+            </w:pPr>
+            <w:proofErr w:type="spellStart"/>
+            <w:r>
+              <w:rPr>
+                <w:rFonts w:eastAsia="Calibri"/>
+                <w:sz w:val="22"/>
+                <w:szCs w:val="22"/>
+              </w:rPr>
+              <w:t>text</w:t>
+            </w:r>
+            <w:proofErr w:type="spellEnd"/>
+          </w:p>
+        </w:tc>
+        <w:tc>
+          <w:tcPr>
+            <w:tcW w:w="915" w:type="dxa"/>
+            <w:shd w:val="clear" w:color="auto" w:fill="D9D9D9"/>
+          </w:tcPr>
+          <w:p>
+            <w:pPr>
+              <w:suppressAutoHyphens/>
+              <w:ind w:left="142"/>
+              <w:jc w:val="center"/>
+              <w:rPr>
+                <w:rFonts w:eastAsia="Calibri"/>
+                <w:sz w:val="22"/>
+                <w:szCs w:val="22"/>
+                <w:lang w:eastAsia="en-US"/>
+              </w:rPr>
+            </w:pPr>
+          </w:p>
+        </w:tc>
+        <w:tc>
+          <w:tcPr>
+            <w:tcW w:w="1829" w:type="dxa"/>
+            <w:shd w:val="clear" w:color="auto" w:fill="D9D9D9"/>
+          </w:tcPr>
+          <w:p>
+            <w:pPr>
+              <w:suppressAutoHyphens/>
+              <w:ind w:left="142"/>
+              <w:jc w:val="center"/>
+              <w:rPr>
+                <w:rFonts w:eastAsia="Calibri"/>
+                <w:sz w:val="22"/>
+                <w:szCs w:val="22"/>
+                <w:lang w:eastAsia="en-US"/>
+              </w:rPr>
+            </w:pPr>
+          </w:p>
+        </w:tc>
+        <w:tc>
+          <w:tcPr>
+            <w:tcW w:w="1067" w:type="dxa"/>
+            <w:shd w:val="clear" w:color="auto" w:fill="D9D9D9"/>
+          </w:tcPr>
+          <w:p>
+            <w:pPr>
+              <w:suppressAutoHyphens/>
+              <w:ind w:left="142"/>
+              <w:jc w:val="center"/>
+              <w:rPr>
+                <w:rFonts w:eastAsia="Calibri"/>
+                <w:sz w:val="22"/>
+                <w:szCs w:val="22"/>
+                <w:lang w:eastAsia="en-US"/>
+              </w:rPr>
+            </w:pPr>
+            <w:r>
+              <w:rPr>
+                <w:rFonts w:eastAsia="Calibri"/>
+                <w:sz w:val="22"/>
+                <w:szCs w:val="22"/>
+                <w:lang w:eastAsia="en-US"/>
+              </w:rPr>
+              <w:t>X</w:t>
+            </w:r>
+          </w:p>
+        </w:tc>
+      </w:tr>
+    </w:tbl>
+    <w:p>
+      <w:pPr>
+        <w:pStyle w:val="Commarcadores"/>
+        <w:tabs>
+          <w:tab w:val="num" w:pos="360"/>
+        </w:tabs>
+        <w:spacing w:before="0" w:after="200" w:line="276" w:lineRule="auto"/>
+        <w:ind w:left="360" w:hanging="360"/>
+        <w:contextualSpacing/>
+        <w:jc w:val="left"/>
+      </w:pPr>
+    </w:p>
+    <w:p>
+      <w:pPr>
+        <w:pStyle w:val="Commarcadores"/>
+        <w:tabs>
+          <w:tab w:val="num" w:pos="360"/>
+        </w:tabs>
+        <w:spacing w:before="0" w:after="200" w:line="276" w:lineRule="auto"/>
+        <w:ind w:left="360" w:hanging="360"/>
+        <w:contextualSpacing/>
+        <w:jc w:val="left"/>
+      </w:pPr>
+    </w:p>
+    <w:p>
+      <w:r>
+        <w:t>Definição de tabela de agendamento</w:t>
+      </w:r>
+    </w:p>
+    <w:tbl>
+      <w:tblPr>
+        <w:tblW w:w="9298" w:type="dxa"/>
+        <w:jc w:val="center"/>
+        <w:tblBorders>
+          <w:top w:val="single" w:sz="8" w:space="0" w:color="404040"/>
+          <w:left w:val="single" w:sz="8" w:space="0" w:color="404040"/>
+          <w:bottom w:val="single" w:sz="8" w:space="0" w:color="404040"/>
+          <w:right w:val="single" w:sz="8" w:space="0" w:color="404040"/>
+          <w:insideH w:val="single" w:sz="8" w:space="0" w:color="404040"/>
+          <w:insideV w:val="single" w:sz="8" w:space="0" w:color="404040"/>
+        </w:tblBorders>
+        <w:shd w:val="clear" w:color="auto" w:fill="D9D9D9"/>
+        <w:tblLayout w:type="fixed"/>
+        <w:tblLook w:val="04A0" w:firstRow="1" w:lastRow="0" w:firstColumn="1" w:lastColumn="0" w:noHBand="0" w:noVBand="1"/>
+      </w:tblPr>
+      <w:tblGrid>
+        <w:gridCol w:w="2286"/>
+        <w:gridCol w:w="3201"/>
+        <w:gridCol w:w="915"/>
+        <w:gridCol w:w="1829"/>
+        <w:gridCol w:w="1067"/>
+      </w:tblGrid>
+      <w:tr>
+        <w:trPr>
+          <w:trHeight w:val="217"/>
+          <w:jc w:val="center"/>
+        </w:trPr>
+        <w:tc>
+          <w:tcPr>
+            <w:tcW w:w="2286" w:type="dxa"/>
+            <w:shd w:val="clear" w:color="auto" w:fill="D9D9D9"/>
+          </w:tcPr>
+          <w:p>
+            <w:pPr>
+              <w:suppressAutoHyphens/>
+              <w:ind w:left="142"/>
+              <w:jc w:val="center"/>
+              <w:rPr>
+                <w:rFonts w:eastAsia="Calibri"/>
+                <w:b/>
+                <w:bCs/>
+                <w:sz w:val="22"/>
+                <w:szCs w:val="22"/>
+              </w:rPr>
+            </w:pPr>
+            <w:r>
+              <w:rPr>
+                <w:rFonts w:eastAsia="Calibri"/>
+                <w:b/>
+                <w:bCs/>
+                <w:sz w:val="22"/>
+                <w:szCs w:val="22"/>
+              </w:rPr>
+              <w:t>Atributo</w:t>
+            </w:r>
+          </w:p>
+        </w:tc>
+        <w:tc>
+          <w:tcPr>
+            <w:tcW w:w="3201" w:type="dxa"/>
+            <w:shd w:val="clear" w:color="auto" w:fill="D9D9D9"/>
+          </w:tcPr>
+          <w:p>
+            <w:pPr>
+              <w:suppressAutoHyphens/>
+              <w:ind w:left="142"/>
+              <w:jc w:val="center"/>
+              <w:rPr>
+                <w:rFonts w:eastAsia="Calibri"/>
+                <w:b/>
+                <w:sz w:val="22"/>
+                <w:szCs w:val="22"/>
+              </w:rPr>
+            </w:pPr>
+            <w:r>
+              <w:rPr>
+                <w:rFonts w:eastAsia="Calibri"/>
+                <w:b/>
+                <w:sz w:val="22"/>
+                <w:szCs w:val="22"/>
+              </w:rPr>
+              <w:t>Tipo</w:t>
+            </w:r>
+          </w:p>
+        </w:tc>
+        <w:tc>
+          <w:tcPr>
+            <w:tcW w:w="915" w:type="dxa"/>
+            <w:shd w:val="clear" w:color="auto" w:fill="D9D9D9"/>
+          </w:tcPr>
+          <w:p>
+            <w:pPr>
+              <w:suppressAutoHyphens/>
+              <w:ind w:left="142"/>
+              <w:jc w:val="center"/>
+              <w:rPr>
+                <w:rFonts w:eastAsia="Calibri"/>
+                <w:b/>
+                <w:sz w:val="22"/>
+                <w:szCs w:val="22"/>
+              </w:rPr>
+            </w:pPr>
+            <w:r>
+              <w:rPr>
+                <w:rFonts w:eastAsia="Calibri"/>
+                <w:b/>
+                <w:sz w:val="22"/>
+                <w:szCs w:val="22"/>
+              </w:rPr>
+              <w:t>Tam.</w:t>
+            </w:r>
+          </w:p>
+        </w:tc>
+        <w:tc>
+          <w:tcPr>
+            <w:tcW w:w="1829" w:type="dxa"/>
+            <w:shd w:val="clear" w:color="auto" w:fill="D9D9D9"/>
+          </w:tcPr>
+          <w:p>
+            <w:pPr>
+              <w:suppressAutoHyphens/>
+              <w:ind w:left="142"/>
+              <w:jc w:val="center"/>
+              <w:rPr>
+                <w:rFonts w:eastAsia="Calibri"/>
+                <w:b/>
+                <w:sz w:val="22"/>
+                <w:szCs w:val="22"/>
+              </w:rPr>
+            </w:pPr>
+            <w:r>
+              <w:rPr>
+                <w:rFonts w:eastAsia="Calibri"/>
+                <w:b/>
+                <w:sz w:val="22"/>
+                <w:szCs w:val="22"/>
+              </w:rPr>
+              <w:t>Máscara</w:t>
+            </w:r>
+          </w:p>
+        </w:tc>
+        <w:tc>
+          <w:tcPr>
+            <w:tcW w:w="1067" w:type="dxa"/>
+            <w:shd w:val="clear" w:color="auto" w:fill="D9D9D9"/>
+          </w:tcPr>
+          <w:p>
+            <w:pPr>
+              <w:suppressAutoHyphens/>
+              <w:ind w:left="142"/>
+              <w:jc w:val="center"/>
+              <w:rPr>
+                <w:rFonts w:eastAsia="Calibri"/>
+                <w:b/>
+                <w:sz w:val="22"/>
+                <w:szCs w:val="22"/>
+              </w:rPr>
+            </w:pPr>
+            <w:proofErr w:type="spellStart"/>
+            <w:r>
+              <w:rPr>
+                <w:rFonts w:eastAsia="Calibri"/>
+                <w:b/>
+                <w:sz w:val="22"/>
+                <w:szCs w:val="22"/>
+              </w:rPr>
+              <w:t>Obrig</w:t>
+            </w:r>
+            <w:proofErr w:type="spellEnd"/>
+            <w:r>
+              <w:rPr>
+                <w:rFonts w:eastAsia="Calibri"/>
+                <w:b/>
+                <w:sz w:val="22"/>
+                <w:szCs w:val="22"/>
+              </w:rPr>
+              <w:t>.</w:t>
+            </w:r>
+          </w:p>
+        </w:tc>
+      </w:tr>
+      <w:tr>
+        <w:trPr>
+          <w:trHeight w:val="241"/>
+          <w:jc w:val="center"/>
+        </w:trPr>
+        <w:tc>
+          <w:tcPr>
+            <w:tcW w:w="2286" w:type="dxa"/>
+            <w:shd w:val="clear" w:color="auto" w:fill="D9D9D9"/>
+          </w:tcPr>
+          <w:p>
+            <w:pPr>
+              <w:suppressAutoHyphens/>
+              <w:ind w:left="142"/>
+              <w:rPr>
+                <w:rFonts w:eastAsia="Calibri"/>
+                <w:b/>
+                <w:bCs/>
+                <w:sz w:val="22"/>
+                <w:szCs w:val="22"/>
+              </w:rPr>
+            </w:pPr>
+            <w:r>
+              <w:rPr>
+                <w:rFonts w:eastAsia="Calibri"/>
+                <w:b/>
+                <w:bCs/>
+                <w:sz w:val="22"/>
+                <w:szCs w:val="22"/>
+              </w:rPr>
+              <w:t>id</w:t>
+            </w:r>
+          </w:p>
+        </w:tc>
+        <w:tc>
+          <w:tcPr>
+            <w:tcW w:w="3201" w:type="dxa"/>
+            <w:shd w:val="clear" w:color="auto" w:fill="D9D9D9"/>
+          </w:tcPr>
+          <w:p>
+            <w:pPr>
+              <w:suppressAutoHyphens/>
+              <w:ind w:left="142"/>
+              <w:rPr>
+                <w:rFonts w:eastAsia="Calibri"/>
+                <w:sz w:val="22"/>
+                <w:szCs w:val="22"/>
+                <w:lang w:eastAsia="en-US"/>
+              </w:rPr>
+            </w:pPr>
+            <w:proofErr w:type="spellStart"/>
+            <w:r>
+              <w:rPr>
+                <w:rFonts w:eastAsia="Calibri"/>
+                <w:sz w:val="22"/>
+                <w:szCs w:val="22"/>
+                <w:lang w:eastAsia="en-US"/>
+              </w:rPr>
+              <w:t>Int</w:t>
+            </w:r>
+            <w:proofErr w:type="spellEnd"/>
+          </w:p>
+        </w:tc>
+        <w:tc>
+          <w:tcPr>
+            <w:tcW w:w="915" w:type="dxa"/>
+            <w:shd w:val="clear" w:color="auto" w:fill="D9D9D9"/>
+          </w:tcPr>
+          <w:p>
+            <w:pPr>
+              <w:suppressAutoHyphens/>
+              <w:ind w:left="142"/>
+              <w:jc w:val="center"/>
+              <w:rPr>
+                <w:rFonts w:eastAsia="Calibri"/>
+                <w:sz w:val="22"/>
+                <w:szCs w:val="22"/>
+                <w:lang w:eastAsia="en-US"/>
+              </w:rPr>
+            </w:pPr>
+            <w:r>
+              <w:rPr>
+                <w:rFonts w:eastAsia="Calibri"/>
+                <w:sz w:val="22"/>
+                <w:szCs w:val="22"/>
+                <w:lang w:eastAsia="en-US"/>
+              </w:rPr>
+              <w:t>11</w:t>
+            </w:r>
+          </w:p>
+        </w:tc>
+        <w:tc>
+          <w:tcPr>
+            <w:tcW w:w="1829" w:type="dxa"/>
+            <w:shd w:val="clear" w:color="auto" w:fill="D9D9D9"/>
+          </w:tcPr>
+          <w:p>
+            <w:pPr>
+              <w:suppressAutoHyphens/>
+              <w:ind w:left="142"/>
+              <w:jc w:val="center"/>
+              <w:rPr>
+                <w:rFonts w:eastAsia="Calibri"/>
+                <w:sz w:val="22"/>
+                <w:szCs w:val="22"/>
+                <w:lang w:eastAsia="en-US"/>
+              </w:rPr>
+            </w:pPr>
+            <w:r>
+              <w:rPr>
+                <w:rFonts w:eastAsia="Calibri"/>
+                <w:sz w:val="22"/>
+                <w:szCs w:val="22"/>
+                <w:lang w:eastAsia="en-US"/>
+              </w:rPr>
+              <w:t>PK</w:t>
+            </w:r>
+          </w:p>
+        </w:tc>
+        <w:tc>
+          <w:tcPr>
+            <w:tcW w:w="1067" w:type="dxa"/>
+            <w:shd w:val="clear" w:color="auto" w:fill="D9D9D9"/>
+          </w:tcPr>
+          <w:p>
+            <w:pPr>
+              <w:suppressAutoHyphens/>
+              <w:ind w:left="142"/>
+              <w:jc w:val="center"/>
+              <w:rPr>
+                <w:rFonts w:eastAsia="Calibri"/>
+                <w:sz w:val="22"/>
+                <w:szCs w:val="22"/>
+                <w:lang w:eastAsia="en-US"/>
+              </w:rPr>
+            </w:pPr>
+            <w:r>
+              <w:rPr>
+                <w:rFonts w:eastAsia="Calibri"/>
+                <w:sz w:val="22"/>
+                <w:szCs w:val="22"/>
+                <w:lang w:eastAsia="en-US"/>
+              </w:rPr>
+              <w:t>X</w:t>
+            </w:r>
+          </w:p>
+        </w:tc>
+      </w:tr>
+      <w:tr>
+        <w:trPr>
+          <w:trHeight w:val="290"/>
+          <w:jc w:val="center"/>
+        </w:trPr>
+        <w:tc>
+          <w:tcPr>
+            <w:tcW w:w="2286" w:type="dxa"/>
+            <w:shd w:val="clear" w:color="auto" w:fill="D9D9D9"/>
+          </w:tcPr>
+          <w:p>
+            <w:pPr>
+              <w:suppressAutoHyphens/>
+              <w:ind w:left="142"/>
+              <w:rPr>
+                <w:rFonts w:eastAsia="Calibri"/>
+                <w:b/>
+                <w:bCs/>
+                <w:sz w:val="22"/>
+                <w:szCs w:val="22"/>
+              </w:rPr>
+            </w:pPr>
+            <w:proofErr w:type="spellStart"/>
+            <w:r>
+              <w:rPr>
+                <w:rFonts w:eastAsia="Calibri"/>
+                <w:b/>
+                <w:bCs/>
+                <w:sz w:val="22"/>
+                <w:szCs w:val="22"/>
+              </w:rPr>
+              <w:t>Nome_cliente</w:t>
+            </w:r>
+            <w:proofErr w:type="spellEnd"/>
+          </w:p>
+        </w:tc>
+        <w:tc>
+          <w:tcPr>
+            <w:tcW w:w="3201" w:type="dxa"/>
+            <w:shd w:val="clear" w:color="auto" w:fill="D9D9D9"/>
+          </w:tcPr>
+          <w:p>
+            <w:pPr>
+              <w:suppressAutoHyphens/>
+              <w:ind w:left="142"/>
+              <w:jc w:val="both"/>
+              <w:rPr>
+                <w:rFonts w:eastAsia="Calibri"/>
+                <w:sz w:val="22"/>
+                <w:szCs w:val="22"/>
+              </w:rPr>
+            </w:pPr>
+            <w:proofErr w:type="spellStart"/>
+            <w:r>
+              <w:rPr>
+                <w:rFonts w:eastAsia="Calibri"/>
+                <w:sz w:val="22"/>
+                <w:szCs w:val="22"/>
+              </w:rPr>
+              <w:t>varchar</w:t>
+            </w:r>
+            <w:proofErr w:type="spellEnd"/>
+          </w:p>
+        </w:tc>
+        <w:tc>
+          <w:tcPr>
+            <w:tcW w:w="915" w:type="dxa"/>
+            <w:shd w:val="clear" w:color="auto" w:fill="D9D9D9"/>
+          </w:tcPr>
+          <w:p>
+            <w:pPr>
+              <w:suppressAutoHyphens/>
+              <w:ind w:left="142"/>
+              <w:jc w:val="center"/>
+              <w:rPr>
+                <w:rFonts w:eastAsia="Calibri"/>
+                <w:sz w:val="22"/>
+                <w:szCs w:val="22"/>
+                <w:lang w:eastAsia="en-US"/>
+              </w:rPr>
+            </w:pPr>
+            <w:r>
+              <w:rPr>
+                <w:rFonts w:eastAsia="Calibri"/>
+                <w:sz w:val="22"/>
+                <w:szCs w:val="22"/>
+                <w:lang w:eastAsia="en-US"/>
+              </w:rPr>
+              <w:t>150</w:t>
+            </w:r>
+          </w:p>
+        </w:tc>
+        <w:tc>
+          <w:tcPr>
+            <w:tcW w:w="1829" w:type="dxa"/>
+            <w:shd w:val="clear" w:color="auto" w:fill="D9D9D9"/>
+          </w:tcPr>
+          <w:p>
+            <w:pPr>
+              <w:suppressAutoHyphens/>
+              <w:ind w:left="142"/>
+              <w:jc w:val="center"/>
+              <w:rPr>
+                <w:rFonts w:eastAsia="Calibri"/>
+                <w:sz w:val="22"/>
+                <w:szCs w:val="22"/>
+                <w:lang w:eastAsia="en-US"/>
+              </w:rPr>
+            </w:pPr>
+          </w:p>
+        </w:tc>
+        <w:tc>
+          <w:tcPr>
+            <w:tcW w:w="1067" w:type="dxa"/>
+            <w:shd w:val="clear" w:color="auto" w:fill="D9D9D9"/>
+          </w:tcPr>
+          <w:p>
+            <w:pPr>
+              <w:suppressAutoHyphens/>
+              <w:ind w:left="142"/>
+              <w:jc w:val="center"/>
+              <w:rPr>
+                <w:rFonts w:eastAsia="Calibri"/>
+                <w:sz w:val="22"/>
+                <w:szCs w:val="22"/>
+                <w:lang w:eastAsia="en-US"/>
+              </w:rPr>
+            </w:pPr>
+            <w:r>
+              <w:rPr>
+                <w:rFonts w:eastAsia="Calibri"/>
+                <w:sz w:val="22"/>
+                <w:szCs w:val="22"/>
+                <w:lang w:eastAsia="en-US"/>
+              </w:rPr>
+              <w:t>X</w:t>
+            </w:r>
+          </w:p>
+        </w:tc>
+      </w:tr>
+      <w:tr>
+        <w:trPr>
+          <w:trHeight w:val="290"/>
+          <w:jc w:val="center"/>
+        </w:trPr>
+        <w:tc>
+          <w:tcPr>
+            <w:tcW w:w="2286" w:type="dxa"/>
+            <w:shd w:val="clear" w:color="auto" w:fill="D9D9D9"/>
+          </w:tcPr>
+          <w:p>
+            <w:pPr>
+              <w:suppressAutoHyphens/>
+              <w:ind w:left="142"/>
+              <w:rPr>
+                <w:rFonts w:eastAsia="Calibri"/>
+                <w:b/>
+                <w:bCs/>
+                <w:sz w:val="22"/>
+                <w:szCs w:val="22"/>
+              </w:rPr>
+            </w:pPr>
+            <w:r>
+              <w:rPr>
+                <w:rFonts w:eastAsia="Calibri"/>
+                <w:b/>
+                <w:bCs/>
+                <w:sz w:val="22"/>
+                <w:szCs w:val="22"/>
+              </w:rPr>
+              <w:t>Telefone</w:t>
+            </w:r>
+          </w:p>
+        </w:tc>
+        <w:tc>
+          <w:tcPr>
+            <w:tcW w:w="3201" w:type="dxa"/>
+            <w:shd w:val="clear" w:color="auto" w:fill="D9D9D9"/>
+          </w:tcPr>
+          <w:p>
+            <w:pPr>
+              <w:suppressAutoHyphens/>
+              <w:ind w:left="142"/>
+              <w:jc w:val="both"/>
+              <w:rPr>
+                <w:rFonts w:eastAsia="Calibri"/>
+                <w:sz w:val="22"/>
+                <w:szCs w:val="22"/>
+              </w:rPr>
+            </w:pPr>
+            <w:proofErr w:type="spellStart"/>
+            <w:r>
+              <w:rPr>
+                <w:rFonts w:eastAsia="Calibri"/>
+                <w:sz w:val="22"/>
+                <w:szCs w:val="22"/>
+              </w:rPr>
+              <w:t>varchar</w:t>
+            </w:r>
+            <w:proofErr w:type="spellEnd"/>
+          </w:p>
+        </w:tc>
+        <w:tc>
+          <w:tcPr>
+            <w:tcW w:w="915" w:type="dxa"/>
+            <w:shd w:val="clear" w:color="auto" w:fill="D9D9D9"/>
+          </w:tcPr>
+          <w:p>
+            <w:pPr>
+              <w:suppressAutoHyphens/>
+              <w:ind w:left="142"/>
+              <w:jc w:val="center"/>
+              <w:rPr>
+                <w:rFonts w:eastAsia="Calibri"/>
+                <w:sz w:val="22"/>
+                <w:szCs w:val="22"/>
+                <w:lang w:eastAsia="en-US"/>
+              </w:rPr>
+            </w:pPr>
+            <w:r>
+              <w:rPr>
+                <w:rFonts w:eastAsia="Calibri"/>
+                <w:sz w:val="22"/>
+                <w:szCs w:val="22"/>
+                <w:lang w:eastAsia="en-US"/>
+              </w:rPr>
+              <w:t>20</w:t>
+            </w:r>
+          </w:p>
+        </w:tc>
+        <w:tc>
+          <w:tcPr>
+            <w:tcW w:w="1829" w:type="dxa"/>
+            <w:shd w:val="clear" w:color="auto" w:fill="D9D9D9"/>
+          </w:tcPr>
+          <w:p>
+            <w:pPr>
+              <w:suppressAutoHyphens/>
+              <w:ind w:left="142"/>
+              <w:jc w:val="center"/>
+              <w:rPr>
+                <w:rFonts w:eastAsia="Calibri"/>
+                <w:sz w:val="22"/>
+                <w:szCs w:val="22"/>
+                <w:lang w:eastAsia="en-US"/>
+              </w:rPr>
+            </w:pPr>
+          </w:p>
+        </w:tc>
+        <w:tc>
+          <w:tcPr>
+            <w:tcW w:w="1067" w:type="dxa"/>
+            <w:shd w:val="clear" w:color="auto" w:fill="D9D9D9"/>
+          </w:tcPr>
+          <w:p>
+            <w:pPr>
+              <w:suppressAutoHyphens/>
+              <w:ind w:left="142"/>
+              <w:jc w:val="center"/>
+              <w:rPr>
+                <w:rFonts w:eastAsia="Calibri"/>
+                <w:sz w:val="22"/>
+                <w:szCs w:val="22"/>
+                <w:lang w:eastAsia="en-US"/>
+              </w:rPr>
+            </w:pPr>
+            <w:r>
+              <w:rPr>
+                <w:rFonts w:eastAsia="Calibri"/>
+                <w:sz w:val="22"/>
+                <w:szCs w:val="22"/>
+                <w:lang w:eastAsia="en-US"/>
+              </w:rPr>
+              <w:t>X</w:t>
+            </w:r>
+          </w:p>
+        </w:tc>
+      </w:tr>
+      <w:tr>
+        <w:trPr>
+          <w:trHeight w:val="290"/>
+          <w:jc w:val="center"/>
+        </w:trPr>
+        <w:tc>
+          <w:tcPr>
+            <w:tcW w:w="2286" w:type="dxa"/>
+            <w:shd w:val="clear" w:color="auto" w:fill="D9D9D9"/>
+          </w:tcPr>
+          <w:p>
+            <w:pPr>
+              <w:suppressAutoHyphens/>
+              <w:ind w:left="142"/>
+              <w:rPr>
+                <w:rFonts w:eastAsia="Calibri"/>
+                <w:b/>
+                <w:bCs/>
+                <w:sz w:val="22"/>
+                <w:szCs w:val="22"/>
+              </w:rPr>
+            </w:pPr>
+            <w:r>
+              <w:rPr>
+                <w:rFonts w:eastAsia="Calibri"/>
+                <w:b/>
+                <w:bCs/>
+                <w:sz w:val="22"/>
+                <w:szCs w:val="22"/>
+              </w:rPr>
+              <w:t>data</w:t>
+            </w:r>
+          </w:p>
+        </w:tc>
+        <w:tc>
+          <w:tcPr>
+            <w:tcW w:w="3201" w:type="dxa"/>
+            <w:shd w:val="clear" w:color="auto" w:fill="D9D9D9"/>
+          </w:tcPr>
+          <w:p>
+            <w:pPr>
+              <w:suppressAutoHyphens/>
+              <w:ind w:left="142"/>
+              <w:jc w:val="both"/>
+              <w:rPr>
+                <w:rFonts w:eastAsia="Calibri"/>
+                <w:sz w:val="22"/>
+                <w:szCs w:val="22"/>
+              </w:rPr>
+            </w:pPr>
+            <w:r>
+              <w:rPr>
+                <w:rFonts w:eastAsia="Calibri"/>
+                <w:sz w:val="22"/>
+                <w:szCs w:val="22"/>
+              </w:rPr>
+              <w:t>date</w:t>
+            </w:r>
+          </w:p>
+        </w:tc>
+        <w:tc>
+          <w:tcPr>
+            <w:tcW w:w="915" w:type="dxa"/>
+            <w:shd w:val="clear" w:color="auto" w:fill="D9D9D9"/>
+          </w:tcPr>
+          <w:p>
+            <w:pPr>
+              <w:suppressAutoHyphens/>
+              <w:ind w:left="142"/>
+              <w:jc w:val="center"/>
+              <w:rPr>
+                <w:rFonts w:eastAsia="Calibri"/>
+                <w:sz w:val="22"/>
+                <w:szCs w:val="22"/>
+                <w:lang w:eastAsia="en-US"/>
+              </w:rPr>
+            </w:pPr>
+          </w:p>
+        </w:tc>
+        <w:tc>
+          <w:tcPr>
+            <w:tcW w:w="1829" w:type="dxa"/>
+            <w:shd w:val="clear" w:color="auto" w:fill="D9D9D9"/>
+          </w:tcPr>
+          <w:p>
+            <w:pPr>
+              <w:suppressAutoHyphens/>
+              <w:ind w:left="142"/>
+              <w:jc w:val="center"/>
+              <w:rPr>
+                <w:rFonts w:eastAsia="Calibri"/>
+                <w:sz w:val="22"/>
+                <w:szCs w:val="22"/>
+                <w:lang w:eastAsia="en-US"/>
+              </w:rPr>
+            </w:pPr>
+          </w:p>
+        </w:tc>
+        <w:tc>
+          <w:tcPr>
+            <w:tcW w:w="1067" w:type="dxa"/>
+            <w:shd w:val="clear" w:color="auto" w:fill="D9D9D9"/>
+          </w:tcPr>
+          <w:p>
+            <w:pPr>
+              <w:suppressAutoHyphens/>
+              <w:ind w:left="142"/>
+              <w:jc w:val="center"/>
+              <w:rPr>
+                <w:rFonts w:eastAsia="Calibri"/>
+                <w:sz w:val="22"/>
+                <w:szCs w:val="22"/>
+                <w:lang w:eastAsia="en-US"/>
+              </w:rPr>
+            </w:pPr>
+          </w:p>
+        </w:tc>
+      </w:tr>
+      <w:tr>
+        <w:trPr>
+          <w:trHeight w:val="290"/>
+          <w:jc w:val="center"/>
+        </w:trPr>
+        <w:tc>
+          <w:tcPr>
+            <w:tcW w:w="2286" w:type="dxa"/>
+            <w:shd w:val="clear" w:color="auto" w:fill="D9D9D9"/>
+          </w:tcPr>
+          <w:p>
+            <w:pPr>
+              <w:suppressAutoHyphens/>
+              <w:ind w:left="142"/>
+              <w:rPr>
+                <w:rFonts w:eastAsia="Calibri"/>
+                <w:b/>
+                <w:bCs/>
+                <w:sz w:val="22"/>
+                <w:szCs w:val="22"/>
+              </w:rPr>
+            </w:pPr>
+            <w:r>
+              <w:rPr>
+                <w:rFonts w:eastAsia="Calibri"/>
+                <w:b/>
+                <w:bCs/>
+                <w:sz w:val="22"/>
+                <w:szCs w:val="22"/>
+              </w:rPr>
+              <w:t xml:space="preserve">Horário </w:t>
+            </w:r>
+          </w:p>
+        </w:tc>
+        <w:tc>
+          <w:tcPr>
+            <w:tcW w:w="3201" w:type="dxa"/>
+            <w:shd w:val="clear" w:color="auto" w:fill="D9D9D9"/>
+          </w:tcPr>
+          <w:p>
+            <w:pPr>
+              <w:suppressAutoHyphens/>
+              <w:ind w:left="142"/>
+              <w:jc w:val="both"/>
+              <w:rPr>
+                <w:rFonts w:eastAsia="Calibri"/>
+                <w:sz w:val="22"/>
+                <w:szCs w:val="22"/>
+              </w:rPr>
+            </w:pPr>
+            <w:r>
+              <w:rPr>
+                <w:rFonts w:eastAsia="Calibri"/>
+                <w:sz w:val="22"/>
+                <w:szCs w:val="22"/>
+              </w:rPr>
+              <w:t>time</w:t>
+            </w:r>
+          </w:p>
+        </w:tc>
+        <w:tc>
+          <w:tcPr>
+            <w:tcW w:w="915" w:type="dxa"/>
+            <w:shd w:val="clear" w:color="auto" w:fill="D9D9D9"/>
+          </w:tcPr>
+          <w:p>
+            <w:pPr>
+              <w:suppressAutoHyphens/>
+              <w:ind w:left="142"/>
+              <w:jc w:val="center"/>
+              <w:rPr>
+                <w:rFonts w:eastAsia="Calibri"/>
+                <w:sz w:val="22"/>
+                <w:szCs w:val="22"/>
+                <w:lang w:eastAsia="en-US"/>
+              </w:rPr>
+            </w:pPr>
+          </w:p>
+        </w:tc>
+        <w:tc>
+          <w:tcPr>
+            <w:tcW w:w="1829" w:type="dxa"/>
+            <w:shd w:val="clear" w:color="auto" w:fill="D9D9D9"/>
+          </w:tcPr>
+          <w:p>
+            <w:pPr>
+              <w:suppressAutoHyphens/>
+              <w:ind w:left="142"/>
+              <w:jc w:val="center"/>
+              <w:rPr>
+                <w:rFonts w:eastAsia="Calibri"/>
+                <w:sz w:val="22"/>
+                <w:szCs w:val="22"/>
+                <w:lang w:eastAsia="en-US"/>
+              </w:rPr>
+            </w:pPr>
+          </w:p>
+        </w:tc>
+        <w:tc>
+          <w:tcPr>
+            <w:tcW w:w="1067" w:type="dxa"/>
+            <w:shd w:val="clear" w:color="auto" w:fill="D9D9D9"/>
+          </w:tcPr>
+          <w:p>
+            <w:pPr>
+              <w:suppressAutoHyphens/>
+              <w:ind w:left="142"/>
+              <w:jc w:val="center"/>
+              <w:rPr>
+                <w:rFonts w:eastAsia="Calibri"/>
+                <w:sz w:val="22"/>
+                <w:szCs w:val="22"/>
+                <w:lang w:eastAsia="en-US"/>
+              </w:rPr>
+            </w:pPr>
+            <w:r>
+              <w:rPr>
+                <w:rFonts w:eastAsia="Calibri"/>
+                <w:sz w:val="22"/>
+                <w:szCs w:val="22"/>
+                <w:lang w:eastAsia="en-US"/>
+              </w:rPr>
+              <w:t>X</w:t>
+            </w:r>
+          </w:p>
+        </w:tc>
+      </w:tr>
+      <w:tr>
+        <w:trPr>
+          <w:trHeight w:val="290"/>
+          <w:jc w:val="center"/>
+        </w:trPr>
+        <w:tc>
+          <w:tcPr>
+            <w:tcW w:w="2286" w:type="dxa"/>
+            <w:shd w:val="clear" w:color="auto" w:fill="D9D9D9"/>
+          </w:tcPr>
+          <w:p>
+            <w:pPr>
+              <w:suppressAutoHyphens/>
+              <w:ind w:left="142"/>
+              <w:rPr>
+                <w:rFonts w:eastAsia="Calibri"/>
+                <w:b/>
+                <w:bCs/>
+                <w:sz w:val="22"/>
+                <w:szCs w:val="22"/>
+              </w:rPr>
+            </w:pPr>
+            <w:proofErr w:type="spellStart"/>
+            <w:r>
+              <w:rPr>
+                <w:rFonts w:eastAsia="Calibri"/>
+                <w:b/>
+                <w:bCs/>
+                <w:sz w:val="22"/>
+                <w:szCs w:val="22"/>
+              </w:rPr>
+              <w:t>Id_servico</w:t>
+            </w:r>
+            <w:proofErr w:type="spellEnd"/>
+          </w:p>
+        </w:tc>
+        <w:tc>
+          <w:tcPr>
+            <w:tcW w:w="3201" w:type="dxa"/>
+            <w:shd w:val="clear" w:color="auto" w:fill="D9D9D9"/>
+          </w:tcPr>
+          <w:p>
+            <w:pPr>
+              <w:suppressAutoHyphens/>
+              <w:ind w:left="142"/>
+              <w:jc w:val="both"/>
+              <w:rPr>
+                <w:rFonts w:eastAsia="Calibri"/>
+                <w:sz w:val="22"/>
+                <w:szCs w:val="22"/>
+              </w:rPr>
+            </w:pPr>
+            <w:proofErr w:type="spellStart"/>
+            <w:r>
+              <w:rPr>
+                <w:rFonts w:eastAsia="Calibri"/>
+                <w:sz w:val="22"/>
+                <w:szCs w:val="22"/>
+              </w:rPr>
+              <w:t>int</w:t>
+            </w:r>
+            <w:proofErr w:type="spellEnd"/>
+          </w:p>
+        </w:tc>
+        <w:tc>
+          <w:tcPr>
+            <w:tcW w:w="915" w:type="dxa"/>
+            <w:shd w:val="clear" w:color="auto" w:fill="D9D9D9"/>
+          </w:tcPr>
+          <w:p>
+            <w:pPr>
+              <w:suppressAutoHyphens/>
+              <w:ind w:left="142"/>
+              <w:jc w:val="center"/>
+              <w:rPr>
+                <w:rFonts w:eastAsia="Calibri"/>
+                <w:sz w:val="22"/>
+                <w:szCs w:val="22"/>
+                <w:lang w:eastAsia="en-US"/>
+              </w:rPr>
+            </w:pPr>
+            <w:r>
+              <w:rPr>
+                <w:rFonts w:eastAsia="Calibri"/>
+                <w:sz w:val="22"/>
+                <w:szCs w:val="22"/>
+                <w:lang w:eastAsia="en-US"/>
+              </w:rPr>
+              <w:t>11</w:t>
+            </w:r>
+          </w:p>
+        </w:tc>
+        <w:tc>
+          <w:tcPr>
+            <w:tcW w:w="1829" w:type="dxa"/>
+            <w:shd w:val="clear" w:color="auto" w:fill="D9D9D9"/>
+          </w:tcPr>
+          <w:p>
+            <w:pPr>
+              <w:suppressAutoHyphens/>
+              <w:ind w:left="142"/>
+              <w:jc w:val="center"/>
+              <w:rPr>
+                <w:rFonts w:eastAsia="Calibri"/>
+                <w:sz w:val="22"/>
+                <w:szCs w:val="22"/>
+                <w:lang w:eastAsia="en-US"/>
+              </w:rPr>
+            </w:pPr>
+            <w:r>
+              <w:rPr>
+                <w:rFonts w:eastAsia="Calibri"/>
+                <w:sz w:val="22"/>
+                <w:szCs w:val="22"/>
+                <w:lang w:eastAsia="en-US"/>
+              </w:rPr>
+              <w:t>FK</w:t>
+            </w:r>
+          </w:p>
+        </w:tc>
+        <w:tc>
+          <w:tcPr>
+            <w:tcW w:w="1067" w:type="dxa"/>
+            <w:shd w:val="clear" w:color="auto" w:fill="D9D9D9"/>
+          </w:tcPr>
+          <w:p>
+            <w:pPr>
+              <w:suppressAutoHyphens/>
+              <w:ind w:left="142"/>
+              <w:jc w:val="center"/>
+              <w:rPr>
+                <w:rFonts w:eastAsia="Calibri"/>
+                <w:sz w:val="22"/>
+                <w:szCs w:val="22"/>
+                <w:lang w:eastAsia="en-US"/>
+              </w:rPr>
+            </w:pPr>
+          </w:p>
+        </w:tc>
+      </w:tr>
+    </w:tbl>
     <w:p/>
     <w:p/>
     <w:p/>
     <w:p/>
     <w:p/>
     <w:p/>
-    <w:p/>
+    <w:p>
+      <w:pPr>
+        <w:pStyle w:val="Ttulo1"/>
+      </w:pPr>
+      <w:r>
+        <w:lastRenderedPageBreak/>
+        <w:t>Fluxos Principais</w:t>
+      </w:r>
+    </w:p>
+    <w:p>
+      <w:pPr>
+        <w:pStyle w:val="Commarcadores"/>
+        <w:tabs>
+          <w:tab w:val="num" w:pos="360"/>
+        </w:tabs>
+        <w:spacing w:before="0" w:after="200" w:line="276" w:lineRule="auto"/>
+        <w:ind w:left="360" w:hanging="360"/>
+        <w:contextualSpacing/>
+        <w:jc w:val="left"/>
+      </w:pPr>
+      <w:r>
+        <w:t>• Cliente acessa serviços → escolhe um serviço → solicita agendamento.</w:t>
+      </w:r>
+    </w:p>
+    <w:p>
+      <w:pPr>
+        <w:pStyle w:val="Commarcadores"/>
+        <w:tabs>
+          <w:tab w:val="num" w:pos="360"/>
+        </w:tabs>
+        <w:spacing w:before="0" w:after="200" w:line="276" w:lineRule="auto"/>
+        <w:ind w:left="360" w:hanging="360"/>
+        <w:contextualSpacing/>
+        <w:jc w:val="left"/>
+      </w:pPr>
+      <w:r>
+        <w:t>• Administrador faz login → acessa painel → gerencia agendamentos.</w:t>
+      </w:r>
+    </w:p>
+    <w:p>
+      <w:pPr>
+        <w:pStyle w:val="Commarcadores"/>
+        <w:tabs>
+          <w:tab w:val="num" w:pos="360"/>
+        </w:tabs>
+        <w:spacing w:before="0" w:after="200" w:line="276" w:lineRule="auto"/>
+        <w:ind w:left="360" w:hanging="360"/>
+        <w:contextualSpacing/>
+        <w:jc w:val="left"/>
+      </w:pPr>
+      <w:r>
+        <w:t>• Administrador cadastra/edita/remove produtos ou serviços.</w:t>
+      </w:r>
+    </w:p>
     <w:p/>
     <w:p/>
     <w:p/>
@@ -3964,6 +6898,18 @@
       <w:startOverride w:val="1"/>
     </w:lvlOverride>
   </w:num>
+  <w:num w:numId="22" w16cid:durableId="1745179995">
+    <w:abstractNumId w:val="19"/>
+  </w:num>
+  <w:num w:numId="23" w16cid:durableId="1564178332">
+    <w:abstractNumId w:val="19"/>
+  </w:num>
+  <w:num w:numId="24" w16cid:durableId="394088243">
+    <w:abstractNumId w:val="19"/>
+  </w:num>
+  <w:num w:numId="25" w16cid:durableId="1118450789">
+    <w:abstractNumId w:val="19"/>
+  </w:num>
   <w:numIdMacAtCleanup w:val="19"/>
 </w:numbering>
 </file>
@@ -4028,7 +6974,7 @@
     <w:lsdException w:name="macro" w:semiHidden="1" w:unhideWhenUsed="1"/>
     <w:lsdException w:name="toa heading" w:semiHidden="1" w:unhideWhenUsed="1"/>
     <w:lsdException w:name="List" w:semiHidden="1" w:unhideWhenUsed="1"/>
-    <w:lsdException w:name="List Bullet" w:semiHidden="1" w:uiPriority="0" w:unhideWhenUsed="1"/>
+    <w:lsdException w:name="List Bullet" w:semiHidden="1" w:unhideWhenUsed="1"/>
     <w:lsdException w:name="List Number" w:semiHidden="1" w:uiPriority="0" w:unhideWhenUsed="1"/>
     <w:lsdException w:name="List 2" w:semiHidden="1" w:unhideWhenUsed="1"/>
     <w:lsdException w:name="List 3" w:semiHidden="1" w:unhideWhenUsed="1"/>
@@ -4569,6 +7515,7 @@
   <w:style w:type="character" w:default="1" w:styleId="Fontepargpadro">
     <w:name w:val="Default Paragraph Font"/>
     <w:uiPriority w:val="1"/>
+    <w:semiHidden/>
     <w:unhideWhenUsed/>
   </w:style>
   <w:style w:type="table" w:default="1" w:styleId="Tabelanormal">
@@ -4803,7 +7750,7 @@
     <w:name w:val="List Bullet"/>
     <w:basedOn w:val="Normal"/>
     <w:autoRedefine/>
-    <w:semiHidden/>
+    <w:uiPriority w:val="99"/>
     <w:pPr>
       <w:spacing w:before="60" w:after="60"/>
       <w:jc w:val="both"/>

</xml_diff>